<commit_message>
chore: scripts, requirements, config, startup updates
</commit_message>
<xml_diff>
--- a/raw/modules/implementation/SOP for Launching WorkinSync on Live ETS Server.docx
+++ b/raw/modules/implementation/SOP for Launching WorkinSync on Live ETS Server.docx
@@ -17,7 +17,7 @@
           <w:szCs w:val="22"/>
         </w:rPr>
       </w:pPr>
-      <w:bookmarkStart w:colFirst="0" w:colLast="0" w:name="_j37ty2fchtb3" w:id="0"/>
+      <w:bookmarkStart w:colFirst="0" w:colLast="0" w:name="_heading=h.9cm9mvvthj2m" w:id="0"/>
       <w:bookmarkEnd w:id="0"/>
       <w:r>
         <w:rPr>
@@ -116,7 +116,7 @@
           <w:szCs w:val="26"/>
         </w:rPr>
       </w:pPr>
-      <w:bookmarkStart w:colFirst="0" w:colLast="0" w:name="_xvhlje2bcdog" w:id="1"/>
+      <w:bookmarkStart w:colFirst="0" w:colLast="0" w:name="_heading=h.o19jcnt7hwrr" w:id="1"/>
       <w:bookmarkEnd w:id="1"/>
       <w:r>
         <w:rPr>
@@ -151,10 +151,11 @@
       <w:pPr>
         <w:numPr>
           <w:ilvl w:val="0"/>
-          <w:numId w:val="21"/>
-        </w:numPr>
-        <w:spacing w:after="0" w:afterAutospacing="0" w:before="240" w:lineRule="auto"/>
-        <w:ind w:left="720" w:hanging="360"/>
+          <w:numId w:val="14"/>
+        </w:numPr>
+        <w:spacing w:after="0" w:before="240" w:lineRule="auto"/>
+        <w:ind w:left="720" w:hanging="360"/>
+        <w:rPr/>
       </w:pPr>
       <w:r>
         <w:rPr>
@@ -167,10 +168,11 @@
       <w:pPr>
         <w:numPr>
           <w:ilvl w:val="0"/>
-          <w:numId w:val="21"/>
-        </w:numPr>
-        <w:spacing w:after="0" w:afterAutospacing="0" w:before="0" w:beforeAutospacing="0" w:lineRule="auto"/>
-        <w:ind w:left="720" w:hanging="360"/>
+          <w:numId w:val="14"/>
+        </w:numPr>
+        <w:spacing w:after="0" w:before="0" w:lineRule="auto"/>
+        <w:ind w:left="720" w:hanging="360"/>
+        <w:rPr/>
       </w:pPr>
       <w:r>
         <w:rPr>
@@ -189,14 +191,19 @@
         </w:rPr>
         <w:t xml:space="preserve">Input required: Downtime schedule and communication plan</w:t>
       </w:r>
+      <w:r>
+        <w:rPr>
+          <w:rtl w:val="0"/>
+        </w:rPr>
+      </w:r>
     </w:p>
     <w:p>
       <w:pPr>
         <w:numPr>
           <w:ilvl w:val="0"/>
-          <w:numId w:val="21"/>
-        </w:numPr>
-        <w:spacing w:after="240" w:before="0" w:beforeAutospacing="0" w:lineRule="auto"/>
+          <w:numId w:val="14"/>
+        </w:numPr>
+        <w:spacing w:after="240" w:before="0" w:lineRule="auto"/>
         <w:ind w:left="720" w:hanging="360"/>
         <w:rPr>
           <w:b w:val="1"/>
@@ -217,6 +224,11 @@
         </w:rPr>
         <w:t xml:space="preserve">Have a backup plan in case something goes wrong. (Have manual trip sheets ready to run the transport operation)</w:t>
       </w:r>
+      <w:r>
+        <w:rPr>
+          <w:rtl w:val="0"/>
+        </w:rPr>
+      </w:r>
     </w:p>
     <w:p>
       <w:pPr>
@@ -239,10 +251,11 @@
       <w:pPr>
         <w:numPr>
           <w:ilvl w:val="0"/>
-          <w:numId w:val="32"/>
-        </w:numPr>
-        <w:spacing w:after="0" w:afterAutospacing="0" w:before="240" w:lineRule="auto"/>
-        <w:ind w:left="720" w:hanging="360"/>
+          <w:numId w:val="26"/>
+        </w:numPr>
+        <w:spacing w:after="0" w:before="240" w:lineRule="auto"/>
+        <w:ind w:left="720" w:hanging="360"/>
+        <w:rPr/>
       </w:pPr>
       <w:r>
         <w:rPr>
@@ -255,10 +268,11 @@
       <w:pPr>
         <w:numPr>
           <w:ilvl w:val="0"/>
-          <w:numId w:val="32"/>
-        </w:numPr>
-        <w:spacing w:after="240" w:before="0" w:beforeAutospacing="0" w:lineRule="auto"/>
-        <w:ind w:left="720" w:hanging="360"/>
+          <w:numId w:val="26"/>
+        </w:numPr>
+        <w:spacing w:after="240" w:before="0" w:lineRule="auto"/>
+        <w:ind w:left="720" w:hanging="360"/>
+        <w:rPr/>
       </w:pPr>
       <w:r>
         <w:rPr>
@@ -277,6 +291,11 @@
         </w:rPr>
         <w:t xml:space="preserve">Example: User Profile with ID,  Transport user (Yes/No).</w:t>
       </w:r>
+      <w:r>
+        <w:rPr>
+          <w:rtl w:val="0"/>
+        </w:rPr>
+      </w:r>
     </w:p>
     <w:p>
       <w:pPr>
@@ -299,10 +318,11 @@
       <w:pPr>
         <w:numPr>
           <w:ilvl w:val="0"/>
-          <w:numId w:val="11"/>
-        </w:numPr>
-        <w:spacing w:after="0" w:afterAutospacing="0" w:before="240" w:lineRule="auto"/>
-        <w:ind w:left="720" w:hanging="360"/>
+          <w:numId w:val="3"/>
+        </w:numPr>
+        <w:spacing w:after="0" w:before="240" w:lineRule="auto"/>
+        <w:ind w:left="720" w:hanging="360"/>
+        <w:rPr/>
       </w:pPr>
       <w:r>
         <w:rPr>
@@ -315,10 +335,11 @@
       <w:pPr>
         <w:numPr>
           <w:ilvl w:val="1"/>
-          <w:numId w:val="11"/>
-        </w:numPr>
-        <w:spacing w:after="0" w:afterAutospacing="0" w:before="0" w:beforeAutospacing="0" w:lineRule="auto"/>
+          <w:numId w:val="3"/>
+        </w:numPr>
+        <w:spacing w:after="0" w:before="0" w:lineRule="auto"/>
         <w:ind w:left="1440" w:hanging="360"/>
+        <w:rPr/>
       </w:pPr>
       <w:r>
         <w:rPr>
@@ -331,10 +352,11 @@
       <w:pPr>
         <w:numPr>
           <w:ilvl w:val="1"/>
-          <w:numId w:val="11"/>
-        </w:numPr>
-        <w:spacing w:after="0" w:afterAutospacing="0" w:before="0" w:beforeAutospacing="0" w:lineRule="auto"/>
+          <w:numId w:val="3"/>
+        </w:numPr>
+        <w:spacing w:after="0" w:before="0" w:lineRule="auto"/>
         <w:ind w:left="1440" w:hanging="360"/>
+        <w:rPr/>
       </w:pPr>
       <w:r>
         <w:rPr>
@@ -347,10 +369,11 @@
       <w:pPr>
         <w:numPr>
           <w:ilvl w:val="1"/>
-          <w:numId w:val="11"/>
-        </w:numPr>
-        <w:spacing w:after="0" w:afterAutospacing="0" w:before="0" w:beforeAutospacing="0" w:lineRule="auto"/>
+          <w:numId w:val="3"/>
+        </w:numPr>
+        <w:spacing w:after="0" w:before="0" w:lineRule="auto"/>
         <w:ind w:left="1440" w:hanging="360"/>
+        <w:rPr/>
       </w:pPr>
       <w:r>
         <w:rPr>
@@ -363,10 +386,11 @@
       <w:pPr>
         <w:numPr>
           <w:ilvl w:val="1"/>
-          <w:numId w:val="11"/>
-        </w:numPr>
-        <w:spacing w:after="240" w:before="0" w:beforeAutospacing="0" w:lineRule="auto"/>
+          <w:numId w:val="3"/>
+        </w:numPr>
+        <w:spacing w:after="240" w:before="0" w:lineRule="auto"/>
         <w:ind w:left="1440" w:hanging="360"/>
+        <w:rPr/>
       </w:pPr>
       <w:r>
         <w:rPr>
@@ -385,6 +409,11 @@
         </w:rPr>
         <w:t xml:space="preserve">Input required: Complete operations study document that was shared.</w:t>
       </w:r>
+      <w:r>
+        <w:rPr>
+          <w:rtl w:val="0"/>
+        </w:rPr>
+      </w:r>
     </w:p>
     <w:p>
       <w:pPr>
@@ -435,10 +464,11 @@
       <w:pPr>
         <w:numPr>
           <w:ilvl w:val="0"/>
-          <w:numId w:val="39"/>
-        </w:numPr>
-        <w:spacing w:after="0" w:afterAutospacing="0" w:before="240" w:lineRule="auto"/>
-        <w:ind w:left="720" w:hanging="360"/>
+          <w:numId w:val="33"/>
+        </w:numPr>
+        <w:spacing w:after="0" w:before="240" w:lineRule="auto"/>
+        <w:ind w:left="720" w:hanging="360"/>
+        <w:rPr/>
       </w:pPr>
       <w:r>
         <w:rPr>
@@ -451,10 +481,11 @@
       <w:pPr>
         <w:numPr>
           <w:ilvl w:val="0"/>
-          <w:numId w:val="39"/>
-        </w:numPr>
-        <w:spacing w:after="240" w:before="0" w:beforeAutospacing="0" w:lineRule="auto"/>
-        <w:ind w:left="720" w:hanging="360"/>
+          <w:numId w:val="33"/>
+        </w:numPr>
+        <w:spacing w:after="240" w:before="0" w:lineRule="auto"/>
+        <w:ind w:left="720" w:hanging="360"/>
+        <w:rPr/>
       </w:pPr>
       <w:r>
         <w:rPr>
@@ -478,6 +509,123 @@
           <w:rtl w:val="0"/>
         </w:rPr>
         <w:t xml:space="preserve">1.5 Desk Allocation File</w:t>
+      </w:r>
+    </w:p>
+    <w:p>
+      <w:pPr>
+        <w:numPr>
+          <w:ilvl w:val="0"/>
+          <w:numId w:val="36"/>
+        </w:numPr>
+        <w:spacing w:after="240" w:before="240" w:lineRule="auto"/>
+        <w:ind w:left="720" w:hanging="360"/>
+        <w:rPr/>
+      </w:pPr>
+      <w:r>
+        <w:rPr>
+          <w:rtl w:val="0"/>
+        </w:rPr>
+        <w:t xml:space="preserve">Prepare the desk allocation file, mapping desks to employees.</w:t>
+        <w:br w:type="textWrapping"/>
+      </w:r>
+      <w:r>
+        <w:rPr>
+          <w:b w:val="1"/>
+          <w:bCs w:val="1"/>
+          <w:i w:val="1"/>
+          <w:iCs w:val="1"/>
+          <w:rtl w:val="0"/>
+        </w:rPr>
+        <w:t xml:space="preserve">Input required: Desk allocation mapping (Allocation type, employee/team name, desk number).</w:t>
+      </w:r>
+      <w:r>
+        <w:rPr>
+          <w:rtl w:val="0"/>
+        </w:rPr>
+      </w:r>
+    </w:p>
+    <w:p>
+      <w:pPr>
+        <w:spacing w:after="240" w:before="240" w:lineRule="auto"/>
+        <w:rPr>
+          <w:b w:val="1"/>
+          <w:bCs w:val="1"/>
+        </w:rPr>
+      </w:pPr>
+      <w:r>
+        <w:rPr>
+          <w:b w:val="1"/>
+          <w:bCs w:val="1"/>
+          <w:rtl w:val="0"/>
+        </w:rPr>
+        <w:t xml:space="preserve">1.6 Decide Check-In Mechanism</w:t>
+      </w:r>
+    </w:p>
+    <w:p>
+      <w:pPr>
+        <w:numPr>
+          <w:ilvl w:val="0"/>
+          <w:numId w:val="22"/>
+        </w:numPr>
+        <w:spacing w:after="0" w:before="240" w:lineRule="auto"/>
+        <w:ind w:left="720" w:hanging="360"/>
+        <w:rPr/>
+      </w:pPr>
+      <w:r>
+        <w:rPr>
+          <w:rtl w:val="0"/>
+        </w:rPr>
+        <w:t xml:space="preserve">Define the process employees will follow to check in to their desks (e.g., Digipass, Scan QR, Access card etc).</w:t>
+      </w:r>
+    </w:p>
+    <w:p>
+      <w:pPr>
+        <w:numPr>
+          <w:ilvl w:val="0"/>
+          <w:numId w:val="22"/>
+        </w:numPr>
+        <w:spacing w:after="240" w:before="0" w:lineRule="auto"/>
+        <w:ind w:left="720" w:hanging="360"/>
+        <w:rPr/>
+      </w:pPr>
+      <w:r>
+        <w:rPr>
+          <w:rtl w:val="0"/>
+        </w:rPr>
+        <w:t xml:space="preserve">Ensure this mechanism aligns with their policy (Especially while launching Geofence restriction).</w:t>
+        <w:br w:type="textWrapping"/>
+      </w:r>
+      <w:r>
+        <w:rPr>
+          <w:b w:val="1"/>
+          <w:bCs w:val="1"/>
+          <w:i w:val="1"/>
+          <w:iCs w:val="1"/>
+          <w:rtl w:val="0"/>
+        </w:rPr>
+        <w:t xml:space="preserve">Input required: Check-in method to be used (App-based/RFID).</w:t>
+      </w:r>
+      <w:r>
+        <w:rPr>
+          <w:rtl w:val="0"/>
+        </w:rPr>
+      </w:r>
+    </w:p>
+    <w:p>
+      <w:pPr>
+        <w:spacing w:after="240" w:before="240" w:lineRule="auto"/>
+        <w:rPr>
+          <w:b w:val="1"/>
+          <w:bCs w:val="1"/>
+        </w:rPr>
+      </w:pPr>
+      <w:r>
+        <w:rPr>
+          <w:b w:val="1"/>
+          <w:bCs w:val="1"/>
+          <w:rtl w:val="0"/>
+        </w:rPr>
+        <w:t xml:space="preserve">1.7 WIS Configuration Details</w:t>
       </w:r>
     </w:p>
     <w:p>
@@ -486,14 +634,32 @@
           <w:ilvl w:val="0"/>
           <w:numId w:val="5"/>
         </w:numPr>
-        <w:spacing w:after="240" w:before="240" w:lineRule="auto"/>
-        <w:ind w:left="720" w:hanging="360"/>
-      </w:pPr>
-      <w:r>
-        <w:rPr>
-          <w:rtl w:val="0"/>
-        </w:rPr>
-        <w:t xml:space="preserve">Prepare the desk allocation file, mapping desks to employees.</w:t>
+        <w:spacing w:after="0" w:before="240" w:lineRule="auto"/>
+        <w:ind w:left="720" w:hanging="360"/>
+        <w:rPr/>
+      </w:pPr>
+      <w:r>
+        <w:rPr>
+          <w:rtl w:val="0"/>
+        </w:rPr>
+        <w:t xml:space="preserve">Have all the WIS configuration details (e.g.,Features and relevant data, Parking/Meeting rooms/ cafeteria etc ) ready and agreed upon.</w:t>
+      </w:r>
+    </w:p>
+    <w:p>
+      <w:pPr>
+        <w:numPr>
+          <w:ilvl w:val="0"/>
+          <w:numId w:val="5"/>
+        </w:numPr>
+        <w:spacing w:after="240" w:before="0" w:lineRule="auto"/>
+        <w:ind w:left="720" w:hanging="360"/>
+        <w:rPr/>
+      </w:pPr>
+      <w:r>
+        <w:rPr>
+          <w:rtl w:val="0"/>
+        </w:rPr>
+        <w:t xml:space="preserve">Ensure all the relevant WIS reports are enabled.</w:t>
         <w:br w:type="textWrapping"/>
       </w:r>
       <w:r>
@@ -504,7 +670,12 @@
           <w:iCs w:val="1"/>
           <w:rtl w:val="0"/>
         </w:rPr>
-        <w:t xml:space="preserve">Input required: Desk allocation mapping (Allocation type, employee/team name, desk number).</w:t>
+        <w:t xml:space="preserve">Input required: Finalized WIS features to be configured.</w:t>
+      </w:r>
+      <w:r>
+        <w:rPr>
+          <w:rtl w:val="0"/>
+        </w:rPr>
       </w:r>
     </w:p>
     <w:p>
@@ -521,178 +692,60 @@
           <w:bCs w:val="1"/>
           <w:rtl w:val="0"/>
         </w:rPr>
-        <w:t xml:space="preserve">1.6 Decide Check-In Mechanism</w:t>
+        <w:t xml:space="preserve">1.8 Backup Data (</w:t>
+      </w:r>
+      <w:r>
+        <w:rPr>
+          <w:b w:val="1"/>
+          <w:bCs w:val="1"/>
+          <w:highlight w:val="yellow"/>
+          <w:rtl w:val="0"/>
+        </w:rPr>
+        <w:t xml:space="preserve">Ensure these informations is scrapped within 60 days from your laptops after the successful launch</w:t>
+      </w:r>
+      <w:r>
+        <w:rPr>
+          <w:b w:val="1"/>
+          <w:bCs w:val="1"/>
+          <w:rtl w:val="0"/>
+        </w:rPr>
+        <w:t xml:space="preserve">)</w:t>
       </w:r>
     </w:p>
     <w:p>
       <w:pPr>
         <w:numPr>
           <w:ilvl w:val="0"/>
-          <w:numId w:val="29"/>
-        </w:numPr>
-        <w:spacing w:after="0" w:afterAutospacing="0" w:before="240" w:lineRule="auto"/>
-        <w:ind w:left="720" w:hanging="360"/>
-      </w:pPr>
-      <w:r>
-        <w:rPr>
-          <w:rtl w:val="0"/>
-        </w:rPr>
-        <w:t xml:space="preserve">Define the process employees will follow to check in to their desks (e.g., Digipass, Scan QR, Access card etc).</w:t>
+          <w:numId w:val="20"/>
+        </w:numPr>
+        <w:spacing w:after="0" w:before="240" w:lineRule="auto"/>
+        <w:ind w:left="720" w:hanging="360"/>
+        <w:rPr/>
+      </w:pPr>
+      <w:r>
+        <w:rPr>
+          <w:b w:val="1"/>
+          <w:bCs w:val="1"/>
+          <w:rtl w:val="0"/>
+        </w:rPr>
+        <w:t xml:space="preserve">Raise an SE ticket</w:t>
+      </w:r>
+      <w:r>
+        <w:rPr>
+          <w:rtl w:val="0"/>
+        </w:rPr>
+        <w:t xml:space="preserve"> to get a configuration backup of the current system.</w:t>
       </w:r>
     </w:p>
     <w:p>
       <w:pPr>
         <w:numPr>
           <w:ilvl w:val="0"/>
-          <w:numId w:val="29"/>
-        </w:numPr>
-        <w:spacing w:after="240" w:before="0" w:beforeAutospacing="0" w:lineRule="auto"/>
-        <w:ind w:left="720" w:hanging="360"/>
-      </w:pPr>
-      <w:r>
-        <w:rPr>
-          <w:rtl w:val="0"/>
-        </w:rPr>
-        <w:t xml:space="preserve">Ensure this mechanism aligns with their policy (Especially while launching Geofence restriction).</w:t>
-        <w:br w:type="textWrapping"/>
-      </w:r>
-      <w:r>
-        <w:rPr>
-          <w:b w:val="1"/>
-          <w:bCs w:val="1"/>
-          <w:i w:val="1"/>
-          <w:iCs w:val="1"/>
-          <w:rtl w:val="0"/>
-        </w:rPr>
-        <w:t xml:space="preserve">Input required: Check-in method to be used (App-based/RFID).</w:t>
-      </w:r>
-    </w:p>
-    <w:p>
-      <w:pPr>
-        <w:spacing w:after="240" w:before="240" w:lineRule="auto"/>
-        <w:rPr>
-          <w:b w:val="1"/>
-          <w:bCs w:val="1"/>
-        </w:rPr>
-      </w:pPr>
-      <w:r>
-        <w:rPr>
-          <w:b w:val="1"/>
-          <w:bCs w:val="1"/>
-          <w:rtl w:val="0"/>
-        </w:rPr>
-        <w:t xml:space="preserve">1.7 WIS Configuration Details</w:t>
-      </w:r>
-    </w:p>
-    <w:p>
-      <w:pPr>
-        <w:numPr>
-          <w:ilvl w:val="0"/>
-          <w:numId w:val="13"/>
-        </w:numPr>
-        <w:spacing w:after="0" w:afterAutospacing="0" w:before="240" w:lineRule="auto"/>
-        <w:ind w:left="720" w:hanging="360"/>
-      </w:pPr>
-      <w:r>
-        <w:rPr>
-          <w:rtl w:val="0"/>
-        </w:rPr>
-        <w:t xml:space="preserve">Have all the WIS configuration details (e.g.,Features and relevant data, Parking/Meeting rooms/ cafeteria etc ) ready and agreed upon.</w:t>
-      </w:r>
-    </w:p>
-    <w:p>
-      <w:pPr>
-        <w:numPr>
-          <w:ilvl w:val="0"/>
-          <w:numId w:val="13"/>
-        </w:numPr>
-        <w:spacing w:after="240" w:before="0" w:beforeAutospacing="0" w:lineRule="auto"/>
-        <w:ind w:left="720" w:hanging="360"/>
-      </w:pPr>
-      <w:r>
-        <w:rPr>
-          <w:rtl w:val="0"/>
-        </w:rPr>
-        <w:t xml:space="preserve">Ensure all the relevant WIS reports are enabled.</w:t>
-        <w:br w:type="textWrapping"/>
-      </w:r>
-      <w:r>
-        <w:rPr>
-          <w:b w:val="1"/>
-          <w:bCs w:val="1"/>
-          <w:i w:val="1"/>
-          <w:iCs w:val="1"/>
-          <w:rtl w:val="0"/>
-        </w:rPr>
-        <w:t xml:space="preserve">Input required: Finalized WIS features to be configured.</w:t>
-      </w:r>
-    </w:p>
-    <w:p>
-      <w:pPr>
-        <w:spacing w:after="240" w:before="240" w:lineRule="auto"/>
-        <w:rPr>
-          <w:b w:val="1"/>
-          <w:bCs w:val="1"/>
-        </w:rPr>
-      </w:pPr>
-      <w:r>
-        <w:rPr>
-          <w:b w:val="1"/>
-          <w:bCs w:val="1"/>
-          <w:rtl w:val="0"/>
-        </w:rPr>
-        <w:t xml:space="preserve">1.8 Backup Data (</w:t>
-      </w:r>
-      <w:r>
-        <w:rPr>
-          <w:b w:val="1"/>
-          <w:bCs w:val="1"/>
-          <w:highlight w:val="yellow"/>
-          <w:rtl w:val="0"/>
-        </w:rPr>
-        <w:t xml:space="preserve">Ensure these informations is scrapped within 60 days from your laptops after the successful launch</w:t>
-      </w:r>
-      <w:r>
-        <w:rPr>
-          <w:b w:val="1"/>
-          <w:bCs w:val="1"/>
-          <w:rtl w:val="0"/>
-        </w:rPr>
-        <w:t xml:space="preserve">)</w:t>
-      </w:r>
-    </w:p>
-    <w:p>
-      <w:pPr>
-        <w:numPr>
-          <w:ilvl w:val="0"/>
-          <w:numId w:val="27"/>
-        </w:numPr>
-        <w:spacing w:after="0" w:afterAutospacing="0" w:before="240" w:lineRule="auto"/>
-        <w:ind w:left="720" w:hanging="360"/>
-      </w:pPr>
-      <w:r>
-        <w:rPr>
-          <w:b w:val="1"/>
-          <w:bCs w:val="1"/>
-          <w:rtl w:val="0"/>
-        </w:rPr>
-        <w:t xml:space="preserve">Raise an SE ticket</w:t>
-      </w:r>
-      <w:r>
-        <w:rPr>
-          <w:rtl w:val="0"/>
-        </w:rPr>
-        <w:t xml:space="preserve"> to get a configuration backup of the current system.</w:t>
-      </w:r>
-    </w:p>
-    <w:p>
-      <w:pPr>
-        <w:numPr>
-          <w:ilvl w:val="0"/>
-          <w:numId w:val="27"/>
-        </w:numPr>
-        <w:spacing w:after="0" w:afterAutospacing="0" w:before="0" w:beforeAutospacing="0" w:lineRule="auto"/>
-        <w:ind w:left="720" w:hanging="360"/>
+          <w:numId w:val="20"/>
+        </w:numPr>
+        <w:spacing w:after="0" w:before="0" w:lineRule="auto"/>
+        <w:ind w:left="720" w:hanging="360"/>
+        <w:rPr/>
       </w:pPr>
       <w:r>
         <w:rPr>
@@ -713,10 +766,11 @@
       <w:pPr>
         <w:numPr>
           <w:ilvl w:val="1"/>
-          <w:numId w:val="27"/>
-        </w:numPr>
-        <w:spacing w:after="0" w:afterAutospacing="0" w:before="0" w:beforeAutospacing="0" w:lineRule="auto"/>
+          <w:numId w:val="20"/>
+        </w:numPr>
+        <w:spacing w:after="0" w:before="0" w:lineRule="auto"/>
         <w:ind w:left="1440" w:hanging="360"/>
+        <w:rPr/>
       </w:pPr>
       <w:r>
         <w:rPr>
@@ -737,9 +791,9 @@
       <w:pPr>
         <w:numPr>
           <w:ilvl w:val="1"/>
-          <w:numId w:val="27"/>
-        </w:numPr>
-        <w:spacing w:after="0" w:afterAutospacing="0" w:before="0" w:beforeAutospacing="0" w:lineRule="auto"/>
+          <w:numId w:val="20"/>
+        </w:numPr>
+        <w:spacing w:after="0" w:before="0" w:lineRule="auto"/>
         <w:ind w:left="1440" w:hanging="360"/>
         <w:rPr>
           <w:b w:val="1"/>
@@ -759,9 +813,9 @@
       <w:pPr>
         <w:numPr>
           <w:ilvl w:val="1"/>
-          <w:numId w:val="27"/>
-        </w:numPr>
-        <w:spacing w:after="0" w:afterAutospacing="0" w:before="0" w:beforeAutospacing="0" w:lineRule="auto"/>
+          <w:numId w:val="20"/>
+        </w:numPr>
+        <w:spacing w:after="0" w:before="0" w:lineRule="auto"/>
         <w:ind w:left="1440" w:hanging="360"/>
         <w:rPr>
           <w:b w:val="1"/>
@@ -781,10 +835,11 @@
       <w:pPr>
         <w:numPr>
           <w:ilvl w:val="1"/>
-          <w:numId w:val="27"/>
-        </w:numPr>
-        <w:spacing w:after="240" w:before="0" w:beforeAutospacing="0" w:lineRule="auto"/>
+          <w:numId w:val="20"/>
+        </w:numPr>
+        <w:spacing w:after="240" w:before="0" w:lineRule="auto"/>
         <w:ind w:left="1440" w:hanging="360"/>
+        <w:rPr/>
       </w:pPr>
       <w:r>
         <w:rPr>
@@ -823,6 +878,11 @@
         </w:rPr>
         <w:t xml:space="preserve">Input required: SE ticket number for configuration backup.</w:t>
       </w:r>
+      <w:r>
+        <w:rPr>
+          <w:rtl w:val="0"/>
+        </w:rPr>
+      </w:r>
     </w:p>
     <w:p>
       <w:pPr>
@@ -863,10 +923,11 @@
       <w:pPr>
         <w:numPr>
           <w:ilvl w:val="0"/>
-          <w:numId w:val="15"/>
-        </w:numPr>
-        <w:spacing w:after="0" w:afterAutospacing="0" w:before="240" w:lineRule="auto"/>
-        <w:ind w:left="720" w:hanging="360"/>
+          <w:numId w:val="7"/>
+        </w:numPr>
+        <w:spacing w:after="0" w:before="240" w:lineRule="auto"/>
+        <w:ind w:left="720" w:hanging="360"/>
+        <w:rPr/>
       </w:pPr>
       <w:r>
         <w:rPr>
@@ -879,9 +940,9 @@
       <w:pPr>
         <w:numPr>
           <w:ilvl w:val="0"/>
-          <w:numId w:val="15"/>
-        </w:numPr>
-        <w:spacing w:after="0" w:afterAutospacing="0" w:before="0" w:beforeAutospacing="0" w:lineRule="auto"/>
+          <w:numId w:val="7"/>
+        </w:numPr>
+        <w:spacing w:after="0" w:before="0" w:lineRule="auto"/>
         <w:ind w:left="720" w:hanging="360"/>
         <w:rPr>
           <w:u w:val="none"/>
@@ -893,14 +954,19 @@
         </w:rPr>
         <w:t xml:space="preserve">Ensure you complete the routing and assign a vehicle for this user.</w:t>
       </w:r>
+      <w:r>
+        <w:rPr>
+          <w:rtl w:val="0"/>
+        </w:rPr>
+      </w:r>
     </w:p>
     <w:p>
       <w:pPr>
         <w:numPr>
           <w:ilvl w:val="0"/>
-          <w:numId w:val="15"/>
-        </w:numPr>
-        <w:spacing w:after="0" w:afterAutospacing="0" w:before="0" w:beforeAutospacing="0" w:lineRule="auto"/>
+          <w:numId w:val="7"/>
+        </w:numPr>
+        <w:spacing w:after="0" w:before="0" w:lineRule="auto"/>
         <w:ind w:left="720" w:hanging="360"/>
         <w:rPr>
           <w:u w:val="none"/>
@@ -912,14 +978,19 @@
         </w:rPr>
         <w:t xml:space="preserve">Ensure this booking reflect on the Mobile app with the OTP</w:t>
       </w:r>
+      <w:r>
+        <w:rPr>
+          <w:rtl w:val="0"/>
+        </w:rPr>
+      </w:r>
     </w:p>
     <w:p>
       <w:pPr>
         <w:numPr>
           <w:ilvl w:val="0"/>
-          <w:numId w:val="15"/>
-        </w:numPr>
-        <w:spacing w:after="240" w:before="0" w:beforeAutospacing="0" w:lineRule="auto"/>
+          <w:numId w:val="7"/>
+        </w:numPr>
+        <w:spacing w:after="240" w:before="0" w:lineRule="auto"/>
         <w:ind w:left="720" w:hanging="360"/>
         <w:rPr>
           <w:u w:val="none"/>
@@ -930,6 +1001,11 @@
           <w:rtl w:val="0"/>
         </w:rPr>
         <w:t xml:space="preserve">Take a screenshot of the transport booking on the mobile app.</w:t>
+      </w:r>
+      <w:r>
+        <w:rPr>
+          <w:rtl w:val="0"/>
+        </w:rPr>
       </w:r>
     </w:p>
     <w:p>
@@ -961,7 +1037,7 @@
           <w:szCs w:val="26"/>
         </w:rPr>
       </w:pPr>
-      <w:bookmarkStart w:colFirst="0" w:colLast="0" w:name="_as192l6yk8y" w:id="2"/>
+      <w:bookmarkStart w:colFirst="0" w:colLast="0" w:name="_heading=h.hfszo85wmsr" w:id="2"/>
       <w:bookmarkEnd w:id="2"/>
       <w:r>
         <w:rPr>
@@ -983,7 +1059,7 @@
           <w:szCs w:val="26"/>
         </w:rPr>
       </w:pPr>
-      <w:bookmarkStart w:colFirst="0" w:colLast="0" w:name="_3gd0o1st5stq" w:id="3"/>
+      <w:bookmarkStart w:colFirst="0" w:colLast="0" w:name="_heading=h.n2zs7gyr9c5u" w:id="3"/>
       <w:bookmarkEnd w:id="3"/>
       <w:r>
         <w:rPr>
@@ -1018,10 +1094,11 @@
       <w:pPr>
         <w:numPr>
           <w:ilvl w:val="0"/>
-          <w:numId w:val="28"/>
-        </w:numPr>
-        <w:spacing w:after="0" w:afterAutospacing="0" w:before="240" w:lineRule="auto"/>
-        <w:ind w:left="720" w:hanging="360"/>
+          <w:numId w:val="21"/>
+        </w:numPr>
+        <w:spacing w:after="0" w:before="240" w:lineRule="auto"/>
+        <w:ind w:left="720" w:hanging="360"/>
+        <w:rPr/>
       </w:pPr>
       <w:r>
         <w:rPr>
@@ -1034,10 +1111,11 @@
       <w:pPr>
         <w:numPr>
           <w:ilvl w:val="1"/>
-          <w:numId w:val="28"/>
-        </w:numPr>
-        <w:spacing w:after="0" w:afterAutospacing="0" w:before="0" w:beforeAutospacing="0" w:lineRule="auto"/>
+          <w:numId w:val="21"/>
+        </w:numPr>
+        <w:spacing w:after="0" w:before="0" w:lineRule="auto"/>
         <w:ind w:left="1440" w:hanging="360"/>
+        <w:rPr/>
       </w:pPr>
       <w:r>
         <w:rPr>
@@ -1050,10 +1128,11 @@
       <w:pPr>
         <w:numPr>
           <w:ilvl w:val="1"/>
-          <w:numId w:val="28"/>
-        </w:numPr>
-        <w:spacing w:after="0" w:afterAutospacing="0" w:before="0" w:beforeAutospacing="0" w:lineRule="auto"/>
+          <w:numId w:val="21"/>
+        </w:numPr>
+        <w:spacing w:after="0" w:before="0" w:lineRule="auto"/>
         <w:ind w:left="1440" w:hanging="360"/>
+        <w:rPr/>
       </w:pPr>
       <w:r>
         <w:rPr>
@@ -1066,27 +1145,17 @@
       <w:pPr>
         <w:numPr>
           <w:ilvl w:val="0"/>
-          <w:numId w:val="28"/>
-        </w:numPr>
-        <w:spacing w:after="240" w:before="0" w:beforeAutospacing="0" w:lineRule="auto"/>
-        <w:ind w:left="720" w:hanging="360"/>
-      </w:pPr>
-      <w:r>
-        <w:rPr>
-          <w:rtl w:val="0"/>
-        </w:rPr>
-        <w:t xml:space="preserve">Raise SE ticker to ensure these are correctly configured on the </w:t>
-      </w:r>
-      <w:r>
-        <w:rPr>
-          <w:rtl w:val="0"/>
-        </w:rPr>
-        <w:t xml:space="preserve">Shift Categories Page on ETS Side.</w:t>
-      </w:r>
-      <w:r>
-        <w:rPr>
-          <w:rtl w:val="0"/>
-        </w:rPr>
+          <w:numId w:val="21"/>
+        </w:numPr>
+        <w:spacing w:after="240" w:before="0" w:lineRule="auto"/>
+        <w:ind w:left="720" w:hanging="360"/>
+        <w:rPr/>
+      </w:pPr>
+      <w:r>
+        <w:rPr>
+          <w:rtl w:val="0"/>
+        </w:rPr>
+        <w:t xml:space="preserve">Raise SE ticker to ensure these are correctly configured on the Shift Categories Page on ETS Side.</w:t>
       </w:r>
     </w:p>
     <w:p>
@@ -1110,10 +1179,11 @@
       <w:pPr>
         <w:numPr>
           <w:ilvl w:val="0"/>
-          <w:numId w:val="8"/>
+          <w:numId w:val="39"/>
         </w:numPr>
         <w:spacing w:after="240" w:before="240" w:lineRule="auto"/>
         <w:ind w:left="720" w:hanging="360"/>
+        <w:rPr/>
       </w:pPr>
       <w:r>
         <w:rPr>
@@ -1133,6 +1203,11 @@
         </w:rPr>
         <w:t xml:space="preserve">Input required: SE ticket number for configuration updates.</w:t>
       </w:r>
+      <w:r>
+        <w:rPr>
+          <w:rtl w:val="0"/>
+        </w:rPr>
+      </w:r>
     </w:p>
     <w:p>
       <w:pPr>
@@ -1155,10 +1230,11 @@
       <w:pPr>
         <w:numPr>
           <w:ilvl w:val="0"/>
-          <w:numId w:val="24"/>
+          <w:numId w:val="17"/>
         </w:numPr>
         <w:spacing w:after="240" w:before="240" w:lineRule="auto"/>
         <w:ind w:left="720" w:hanging="360"/>
+        <w:rPr/>
       </w:pPr>
       <w:r>
         <w:rPr>
@@ -1205,6 +1281,11 @@
         </w:rPr>
         <w:t xml:space="preserve">Input required: Cleaned up SVG and JSON floor/parking plan uploads.</w:t>
       </w:r>
+      <w:r>
+        <w:rPr>
+          <w:rtl w:val="0"/>
+        </w:rPr>
+      </w:r>
     </w:p>
     <w:p>
       <w:pPr>
@@ -1244,10 +1325,11 @@
       <w:pPr>
         <w:numPr>
           <w:ilvl w:val="0"/>
-          <w:numId w:val="10"/>
-        </w:numPr>
-        <w:spacing w:after="0" w:afterAutospacing="0" w:before="240" w:lineRule="auto"/>
-        <w:ind w:left="720" w:hanging="360"/>
+          <w:numId w:val="2"/>
+        </w:numPr>
+        <w:spacing w:after="0" w:before="240" w:lineRule="auto"/>
+        <w:ind w:left="720" w:hanging="360"/>
+        <w:rPr/>
       </w:pPr>
       <w:r>
         <w:rPr>
@@ -1260,10 +1342,11 @@
       <w:pPr>
         <w:numPr>
           <w:ilvl w:val="1"/>
-          <w:numId w:val="10"/>
-        </w:numPr>
-        <w:spacing w:after="0" w:afterAutospacing="0" w:before="0" w:beforeAutospacing="0" w:lineRule="auto"/>
+          <w:numId w:val="2"/>
+        </w:numPr>
+        <w:spacing w:after="0" w:before="0" w:lineRule="auto"/>
         <w:ind w:left="1440" w:hanging="360"/>
+        <w:rPr/>
       </w:pPr>
       <w:r>
         <w:rPr>
@@ -1284,9 +1367,9 @@
       <w:pPr>
         <w:numPr>
           <w:ilvl w:val="1"/>
-          <w:numId w:val="10"/>
-        </w:numPr>
-        <w:spacing w:after="240" w:before="0" w:beforeAutospacing="0" w:lineRule="auto"/>
+          <w:numId w:val="2"/>
+        </w:numPr>
+        <w:spacing w:after="240" w:before="0" w:lineRule="auto"/>
         <w:ind w:left="1440" w:hanging="360"/>
         <w:rPr>
           <w:b w:val="1"/>
@@ -1333,7 +1416,7 @@
           <w:szCs w:val="26"/>
         </w:rPr>
       </w:pPr>
-      <w:bookmarkStart w:colFirst="0" w:colLast="0" w:name="_vtk16atiolan" w:id="4"/>
+      <w:bookmarkStart w:colFirst="0" w:colLast="0" w:name="_heading=h.43g5oyf1yf4k" w:id="4"/>
       <w:bookmarkEnd w:id="4"/>
       <w:r>
         <w:rPr>
@@ -1355,7 +1438,7 @@
           <w:szCs w:val="26"/>
         </w:rPr>
       </w:pPr>
-      <w:bookmarkStart w:colFirst="0" w:colLast="0" w:name="_bsqlbltactk0" w:id="5"/>
+      <w:bookmarkStart w:colFirst="0" w:colLast="0" w:name="_heading=h.6twf2a7dct1h" w:id="5"/>
       <w:bookmarkEnd w:id="5"/>
       <w:r>
         <w:rPr>
@@ -1390,10 +1473,11 @@
       <w:pPr>
         <w:numPr>
           <w:ilvl w:val="0"/>
-          <w:numId w:val="23"/>
-        </w:numPr>
-        <w:spacing w:after="0" w:afterAutospacing="0" w:before="240" w:lineRule="auto"/>
-        <w:ind w:left="720" w:hanging="360"/>
+          <w:numId w:val="16"/>
+        </w:numPr>
+        <w:spacing w:after="0" w:before="240" w:lineRule="auto"/>
+        <w:ind w:left="720" w:hanging="360"/>
+        <w:rPr/>
       </w:pPr>
       <w:r>
         <w:rPr>
@@ -1406,10 +1490,11 @@
       <w:pPr>
         <w:numPr>
           <w:ilvl w:val="0"/>
-          <w:numId w:val="23"/>
-        </w:numPr>
-        <w:spacing w:after="0" w:afterAutospacing="0" w:before="0" w:beforeAutospacing="0" w:lineRule="auto"/>
-        <w:ind w:left="720" w:hanging="360"/>
+          <w:numId w:val="16"/>
+        </w:numPr>
+        <w:spacing w:after="0" w:before="0" w:lineRule="auto"/>
+        <w:ind w:left="720" w:hanging="360"/>
+        <w:rPr/>
       </w:pPr>
       <w:r>
         <w:rPr>
@@ -1422,9 +1507,9 @@
       <w:pPr>
         <w:numPr>
           <w:ilvl w:val="0"/>
-          <w:numId w:val="23"/>
-        </w:numPr>
-        <w:spacing w:after="0" w:afterAutospacing="0" w:before="0" w:beforeAutospacing="0" w:lineRule="auto"/>
+          <w:numId w:val="16"/>
+        </w:numPr>
+        <w:spacing w:after="0" w:before="0" w:lineRule="auto"/>
         <w:ind w:left="720" w:hanging="360"/>
         <w:rPr>
           <w:u w:val="none"/>
@@ -1436,14 +1521,19 @@
         </w:rPr>
         <w:t xml:space="preserve">Validate if the OTP is appearing is same as the one that was reflected earlier</w:t>
       </w:r>
+      <w:r>
+        <w:rPr>
+          <w:rtl w:val="0"/>
+        </w:rPr>
+      </w:r>
     </w:p>
     <w:p>
       <w:pPr>
         <w:numPr>
           <w:ilvl w:val="0"/>
-          <w:numId w:val="23"/>
-        </w:numPr>
-        <w:spacing w:after="240" w:before="0" w:beforeAutospacing="0" w:lineRule="auto"/>
+          <w:numId w:val="16"/>
+        </w:numPr>
+        <w:spacing w:after="240" w:before="0" w:lineRule="auto"/>
         <w:ind w:left="720" w:hanging="360"/>
         <w:rPr>
           <w:u w:val="none"/>
@@ -1454,6 +1544,11 @@
           <w:rtl w:val="0"/>
         </w:rPr>
         <w:t xml:space="preserve">Check the Routes page to ensure if the routing and booking count is not affected.</w:t>
+      </w:r>
+      <w:r>
+        <w:rPr>
+          <w:rtl w:val="0"/>
+        </w:rPr>
       </w:r>
     </w:p>
     <w:p>
@@ -1480,10 +1575,11 @@
       <w:pPr>
         <w:numPr>
           <w:ilvl w:val="0"/>
-          <w:numId w:val="17"/>
-        </w:numPr>
-        <w:spacing w:after="0" w:afterAutospacing="0" w:before="240" w:lineRule="auto"/>
-        <w:ind w:left="720" w:hanging="360"/>
+          <w:numId w:val="9"/>
+        </w:numPr>
+        <w:spacing w:after="0" w:before="240" w:lineRule="auto"/>
+        <w:ind w:left="720" w:hanging="360"/>
+        <w:rPr/>
       </w:pPr>
       <w:r>
         <w:rPr>
@@ -1496,10 +1592,11 @@
       <w:pPr>
         <w:numPr>
           <w:ilvl w:val="0"/>
-          <w:numId w:val="17"/>
-        </w:numPr>
-        <w:spacing w:after="240" w:before="0" w:beforeAutospacing="0" w:lineRule="auto"/>
-        <w:ind w:left="720" w:hanging="360"/>
+          <w:numId w:val="9"/>
+        </w:numPr>
+        <w:spacing w:after="240" w:before="0" w:lineRule="auto"/>
+        <w:ind w:left="720" w:hanging="360"/>
+        <w:rPr/>
       </w:pPr>
       <w:r>
         <w:rPr>
@@ -1552,7 +1649,7 @@
           <w:szCs w:val="26"/>
         </w:rPr>
       </w:pPr>
-      <w:bookmarkStart w:colFirst="0" w:colLast="0" w:name="_74z3cjnaok6t" w:id="6"/>
+      <w:bookmarkStart w:colFirst="0" w:colLast="0" w:name="_heading=h.z0nfvikc5efy" w:id="6"/>
       <w:bookmarkEnd w:id="6"/>
       <w:r>
         <w:rPr>
@@ -1588,9 +1685,9 @@
       <w:pPr>
         <w:numPr>
           <w:ilvl w:val="0"/>
-          <w:numId w:val="30"/>
-        </w:numPr>
-        <w:spacing w:after="0" w:afterAutospacing="0" w:before="240" w:lineRule="auto"/>
+          <w:numId w:val="24"/>
+        </w:numPr>
+        <w:spacing w:after="0" w:before="240" w:lineRule="auto"/>
         <w:ind w:left="720" w:hanging="360"/>
         <w:rPr>
           <w:b w:val="1"/>
@@ -1611,14 +1708,19 @@
         </w:rPr>
         <w:t xml:space="preserve">Migration is not successful.</w:t>
       </w:r>
+      <w:r>
+        <w:rPr>
+          <w:rtl w:val="0"/>
+        </w:rPr>
+      </w:r>
     </w:p>
     <w:p>
       <w:pPr>
         <w:numPr>
           <w:ilvl w:val="0"/>
-          <w:numId w:val="30"/>
-        </w:numPr>
-        <w:spacing w:after="240" w:before="0" w:beforeAutospacing="0" w:lineRule="auto"/>
+          <w:numId w:val="24"/>
+        </w:numPr>
+        <w:spacing w:after="240" w:before="0" w:lineRule="auto"/>
         <w:ind w:left="720" w:hanging="360"/>
         <w:rPr>
           <w:b w:val="1"/>
@@ -1639,6 +1741,11 @@
         </w:rPr>
         <w:t xml:space="preserve">: Re-check the migration process and ensure all bookings were transferred correctly and appear on Work Planner. Try to Re-upload all the future bookings in the new format if the API doesn’t help migrating.</w:t>
       </w:r>
+      <w:r>
+        <w:rPr>
+          <w:rtl w:val="0"/>
+        </w:rPr>
+      </w:r>
     </w:p>
     <w:p>
       <w:pPr>
@@ -1661,9 +1768,9 @@
       <w:pPr>
         <w:numPr>
           <w:ilvl w:val="0"/>
-          <w:numId w:val="33"/>
-        </w:numPr>
-        <w:spacing w:after="0" w:afterAutospacing="0" w:before="240" w:lineRule="auto"/>
+          <w:numId w:val="27"/>
+        </w:numPr>
+        <w:spacing w:after="0" w:before="240" w:lineRule="auto"/>
         <w:ind w:left="720" w:hanging="360"/>
         <w:rPr>
           <w:b w:val="1"/>
@@ -1684,14 +1791,19 @@
         </w:rPr>
         <w:t xml:space="preserve">App display issue.</w:t>
       </w:r>
+      <w:r>
+        <w:rPr>
+          <w:rtl w:val="0"/>
+        </w:rPr>
+      </w:r>
     </w:p>
     <w:p>
       <w:pPr>
         <w:numPr>
           <w:ilvl w:val="0"/>
-          <w:numId w:val="33"/>
-        </w:numPr>
-        <w:spacing w:after="0" w:afterAutospacing="0" w:before="0" w:beforeAutospacing="0" w:lineRule="auto"/>
+          <w:numId w:val="27"/>
+        </w:numPr>
+        <w:spacing w:after="0" w:before="0" w:lineRule="auto"/>
         <w:ind w:left="720" w:hanging="360"/>
         <w:rPr>
           <w:b w:val="1"/>
@@ -1711,9 +1823,9 @@
       <w:pPr>
         <w:numPr>
           <w:ilvl w:val="1"/>
-          <w:numId w:val="33"/>
-        </w:numPr>
-        <w:spacing w:after="0" w:afterAutospacing="0" w:before="0" w:beforeAutospacing="0" w:lineRule="auto"/>
+          <w:numId w:val="27"/>
+        </w:numPr>
+        <w:spacing w:after="0" w:before="0" w:lineRule="auto"/>
         <w:ind w:left="1440" w:hanging="360"/>
         <w:rPr/>
       </w:pPr>
@@ -1728,9 +1840,9 @@
       <w:pPr>
         <w:numPr>
           <w:ilvl w:val="1"/>
-          <w:numId w:val="33"/>
-        </w:numPr>
-        <w:spacing w:after="240" w:before="0" w:beforeAutospacing="0" w:lineRule="auto"/>
+          <w:numId w:val="27"/>
+        </w:numPr>
+        <w:spacing w:after="240" w:before="0" w:lineRule="auto"/>
         <w:ind w:left="1440" w:hanging="360"/>
         <w:rPr/>
       </w:pPr>
@@ -1762,9 +1874,9 @@
       <w:pPr>
         <w:numPr>
           <w:ilvl w:val="0"/>
-          <w:numId w:val="16"/>
-        </w:numPr>
-        <w:spacing w:after="0" w:afterAutospacing="0" w:before="240" w:lineRule="auto"/>
+          <w:numId w:val="8"/>
+        </w:numPr>
+        <w:spacing w:after="0" w:before="240" w:lineRule="auto"/>
         <w:ind w:left="720" w:hanging="360"/>
         <w:rPr>
           <w:b w:val="1"/>
@@ -1785,14 +1897,19 @@
         </w:rPr>
         <w:t xml:space="preserve">WorkPlanner sync issue.</w:t>
       </w:r>
+      <w:r>
+        <w:rPr>
+          <w:rtl w:val="0"/>
+        </w:rPr>
+      </w:r>
     </w:p>
     <w:p>
       <w:pPr>
         <w:numPr>
           <w:ilvl w:val="0"/>
-          <w:numId w:val="16"/>
-        </w:numPr>
-        <w:spacing w:after="240" w:before="0" w:beforeAutospacing="0" w:lineRule="auto"/>
+          <w:numId w:val="8"/>
+        </w:numPr>
+        <w:spacing w:after="240" w:before="0" w:lineRule="auto"/>
         <w:ind w:left="720" w:hanging="360"/>
         <w:rPr>
           <w:b w:val="1"/>
@@ -1813,6 +1930,11 @@
         </w:rPr>
         <w:t xml:space="preserve">Contact the Tech Team to check the synchronization between the mobile app and WorkPlanner.</w:t>
       </w:r>
+      <w:r>
+        <w:rPr>
+          <w:rtl w:val="0"/>
+        </w:rPr>
+      </w:r>
     </w:p>
     <w:p>
       <w:pPr>
@@ -1845,9 +1967,9 @@
       <w:pPr>
         <w:numPr>
           <w:ilvl w:val="0"/>
-          <w:numId w:val="37"/>
-        </w:numPr>
-        <w:spacing w:after="0" w:afterAutospacing="0" w:before="240" w:lineRule="auto"/>
+          <w:numId w:val="31"/>
+        </w:numPr>
+        <w:spacing w:after="0" w:before="240" w:lineRule="auto"/>
         <w:ind w:left="720" w:hanging="360"/>
         <w:rPr>
           <w:b w:val="1"/>
@@ -1882,14 +2004,19 @@
         </w:rPr>
         <w:t xml:space="preserve">Serious Transport operational issues. Overlapping booking is created</w:t>
       </w:r>
+      <w:r>
+        <w:rPr>
+          <w:rtl w:val="0"/>
+        </w:rPr>
+      </w:r>
     </w:p>
     <w:p>
       <w:pPr>
         <w:numPr>
           <w:ilvl w:val="0"/>
-          <w:numId w:val="37"/>
-        </w:numPr>
-        <w:spacing w:after="240" w:before="0" w:beforeAutospacing="0" w:lineRule="auto"/>
+          <w:numId w:val="31"/>
+        </w:numPr>
+        <w:spacing w:after="240" w:before="0" w:lineRule="auto"/>
         <w:ind w:left="720" w:hanging="360"/>
         <w:rPr>
           <w:b w:val="1"/>
@@ -1910,6 +2037,11 @@
         </w:rPr>
         <w:t xml:space="preserve">: Involve the Tech Team immediately to investigate the OTP mismatch. This could cause problems for users during Login, so prioritize fixing this. If nothing helps, remove all the booking and redo the booking.  Ensure the past bookings are removed from the ETS side as well before reuploading the bookings on the WIS side.</w:t>
       </w:r>
+      <w:r>
+        <w:rPr>
+          <w:rtl w:val="0"/>
+        </w:rPr>
+      </w:r>
     </w:p>
     <w:p>
       <w:pPr>
@@ -1932,9 +2064,9 @@
       <w:pPr>
         <w:numPr>
           <w:ilvl w:val="0"/>
-          <w:numId w:val="18"/>
-        </w:numPr>
-        <w:spacing w:after="0" w:afterAutospacing="0" w:before="240" w:lineRule="auto"/>
+          <w:numId w:val="10"/>
+        </w:numPr>
+        <w:spacing w:after="0" w:before="240" w:lineRule="auto"/>
         <w:ind w:left="720" w:hanging="360"/>
         <w:rPr>
           <w:b w:val="1"/>
@@ -1955,14 +2087,19 @@
         </w:rPr>
         <w:t xml:space="preserve">Improper trip-sheet display.</w:t>
       </w:r>
+      <w:r>
+        <w:rPr>
+          <w:rtl w:val="0"/>
+        </w:rPr>
+      </w:r>
     </w:p>
     <w:p>
       <w:pPr>
         <w:numPr>
           <w:ilvl w:val="0"/>
-          <w:numId w:val="18"/>
-        </w:numPr>
-        <w:spacing w:after="240" w:before="0" w:beforeAutospacing="0" w:lineRule="auto"/>
+          <w:numId w:val="10"/>
+        </w:numPr>
+        <w:spacing w:after="240" w:before="0" w:lineRule="auto"/>
         <w:ind w:left="720" w:hanging="360"/>
         <w:rPr>
           <w:b w:val="1"/>
@@ -1982,6 +2119,11 @@
           <w:rtl w:val="0"/>
         </w:rPr>
         <w:t xml:space="preserve">Ask the driver to clear caches on the mobile app or uninstall the app and reinstall. Talk to the Employee experience team and ask them to resolve the issue with an incorrect trip sheet.If nothing helps, remove all the booking and redo the booking.  Ensure the past bookings are removed from the ETS side as well before reuploading the bookings on the WIS side.</w:t>
+      </w:r>
+      <w:r>
+        <w:rPr>
+          <w:rtl w:val="0"/>
+        </w:rPr>
       </w:r>
     </w:p>
     <w:p>
@@ -2017,9 +2159,9 @@
       <w:pPr>
         <w:numPr>
           <w:ilvl w:val="0"/>
-          <w:numId w:val="9"/>
-        </w:numPr>
-        <w:spacing w:after="0" w:afterAutospacing="0" w:before="240" w:lineRule="auto"/>
+          <w:numId w:val="40"/>
+        </w:numPr>
+        <w:spacing w:after="0" w:before="240" w:lineRule="auto"/>
         <w:ind w:left="720" w:hanging="360"/>
         <w:rPr>
           <w:b w:val="1"/>
@@ -2040,14 +2182,19 @@
         </w:rPr>
         <w:t xml:space="preserve"> Users see incorrect desk assignments or can not see any seat available.</w:t>
       </w:r>
+      <w:r>
+        <w:rPr>
+          <w:rtl w:val="0"/>
+        </w:rPr>
+      </w:r>
     </w:p>
     <w:p>
       <w:pPr>
         <w:numPr>
           <w:ilvl w:val="0"/>
-          <w:numId w:val="9"/>
-        </w:numPr>
-        <w:spacing w:after="240" w:before="0" w:beforeAutospacing="0" w:lineRule="auto"/>
+          <w:numId w:val="40"/>
+        </w:numPr>
+        <w:spacing w:after="240" w:before="0" w:lineRule="auto"/>
         <w:ind w:left="720" w:hanging="360"/>
         <w:rPr>
           <w:b w:val="1"/>
@@ -2068,6 +2215,11 @@
         </w:rPr>
         <w:t xml:space="preserve">Double-check the desk allocation file used during migration. Consult the client to ensure desk assignments are mapped correctly and updated on the system.It could also be possible all the seats allocated to their team are already reserved.</w:t>
       </w:r>
+      <w:r>
+        <w:rPr>
+          <w:rtl w:val="0"/>
+        </w:rPr>
+      </w:r>
     </w:p>
     <w:p>
       <w:pPr>
@@ -2090,9 +2242,9 @@
       <w:pPr>
         <w:numPr>
           <w:ilvl w:val="0"/>
-          <w:numId w:val="26"/>
-        </w:numPr>
-        <w:spacing w:after="0" w:afterAutospacing="0" w:before="240" w:lineRule="auto"/>
+          <w:numId w:val="19"/>
+        </w:numPr>
+        <w:spacing w:after="0" w:before="240" w:lineRule="auto"/>
         <w:ind w:left="720" w:hanging="360"/>
         <w:rPr>
           <w:b w:val="1"/>
@@ -2113,14 +2265,19 @@
         </w:rPr>
         <w:t xml:space="preserve">Missing user profile or user logs in using an email or phone number that's not registered.</w:t>
       </w:r>
+      <w:r>
+        <w:rPr>
+          <w:rtl w:val="0"/>
+        </w:rPr>
+      </w:r>
     </w:p>
     <w:p>
       <w:pPr>
         <w:numPr>
           <w:ilvl w:val="0"/>
-          <w:numId w:val="26"/>
-        </w:numPr>
-        <w:spacing w:after="240" w:before="0" w:beforeAutospacing="0" w:lineRule="auto"/>
+          <w:numId w:val="19"/>
+        </w:numPr>
+        <w:spacing w:after="240" w:before="0" w:lineRule="auto"/>
         <w:ind w:left="720" w:hanging="360"/>
         <w:rPr>
           <w:b w:val="1"/>
@@ -2141,6 +2298,11 @@
         </w:rPr>
         <w:t xml:space="preserve">Ensure you check details employee use to logging into the system</w:t>
       </w:r>
+      <w:r>
+        <w:rPr>
+          <w:rtl w:val="0"/>
+        </w:rPr>
+      </w:r>
     </w:p>
     <w:p>
       <w:pPr>
@@ -2163,9 +2325,9 @@
       <w:pPr>
         <w:numPr>
           <w:ilvl w:val="0"/>
-          <w:numId w:val="7"/>
-        </w:numPr>
-        <w:spacing w:after="0" w:afterAutospacing="0" w:before="240" w:lineRule="auto"/>
+          <w:numId w:val="38"/>
+        </w:numPr>
+        <w:spacing w:after="0" w:before="240" w:lineRule="auto"/>
         <w:ind w:left="720" w:hanging="360"/>
         <w:rPr>
           <w:b w:val="1"/>
@@ -2186,14 +2348,19 @@
         </w:rPr>
         <w:t xml:space="preserve">Partial migration issue.</w:t>
       </w:r>
+      <w:r>
+        <w:rPr>
+          <w:rtl w:val="0"/>
+        </w:rPr>
+      </w:r>
     </w:p>
     <w:p>
       <w:pPr>
         <w:numPr>
           <w:ilvl w:val="0"/>
-          <w:numId w:val="7"/>
-        </w:numPr>
-        <w:spacing w:after="240" w:before="0" w:beforeAutospacing="0" w:lineRule="auto"/>
+          <w:numId w:val="38"/>
+        </w:numPr>
+        <w:spacing w:after="240" w:before="0" w:lineRule="auto"/>
         <w:ind w:left="720" w:hanging="360"/>
         <w:rPr>
           <w:b w:val="1"/>
@@ -2214,6 +2381,11 @@
         </w:rPr>
         <w:t xml:space="preserve"> Identify affected users and review the migration logs. If specific users' data was not transferred, involve Akshay/Anirban to use the migration API for those users. Ensure no booking data was lost in the process. (If this is time sensitive, create a fresh booking)</w:t>
       </w:r>
+      <w:r>
+        <w:rPr>
+          <w:rtl w:val="0"/>
+        </w:rPr>
+      </w:r>
     </w:p>
     <w:p>
       <w:pPr>
@@ -2230,6 +2402,727 @@
           <w:rtl w:val="0"/>
         </w:rPr>
         <w:t xml:space="preserve">4.9 Desk Shift Not Appearing for Non-Transport Users</w:t>
+      </w:r>
+    </w:p>
+    <w:p>
+      <w:pPr>
+        <w:numPr>
+          <w:ilvl w:val="0"/>
+          <w:numId w:val="18"/>
+        </w:numPr>
+        <w:spacing w:after="0" w:before="240" w:lineRule="auto"/>
+        <w:ind w:left="720" w:hanging="360"/>
+        <w:rPr>
+          <w:b w:val="1"/>
+          <w:bCs w:val="1"/>
+        </w:rPr>
+      </w:pPr>
+      <w:r>
+        <w:rPr>
+          <w:b w:val="1"/>
+          <w:bCs w:val="1"/>
+          <w:rtl w:val="0"/>
+        </w:rPr>
+        <w:t xml:space="preserve">Issue: </w:t>
+      </w:r>
+      <w:r>
+        <w:rPr>
+          <w:rtl w:val="0"/>
+        </w:rPr>
+        <w:t xml:space="preserve">Non-transport user shifts not configured properly or shift refresh issue</w:t>
+      </w:r>
+      <w:r>
+        <w:rPr>
+          <w:rtl w:val="0"/>
+        </w:rPr>
+      </w:r>
+    </w:p>
+    <w:p>
+      <w:pPr>
+        <w:numPr>
+          <w:ilvl w:val="0"/>
+          <w:numId w:val="18"/>
+        </w:numPr>
+        <w:spacing w:after="240" w:before="0" w:lineRule="auto"/>
+        <w:ind w:left="720" w:hanging="360"/>
+        <w:rPr>
+          <w:b w:val="1"/>
+          <w:bCs w:val="1"/>
+        </w:rPr>
+      </w:pPr>
+      <w:r>
+        <w:rPr>
+          <w:b w:val="1"/>
+          <w:bCs w:val="1"/>
+          <w:rtl w:val="0"/>
+        </w:rPr>
+        <w:t xml:space="preserve">Action: </w:t>
+      </w:r>
+      <w:r>
+        <w:rPr>
+          <w:rtl w:val="0"/>
+        </w:rPr>
+        <w:t xml:space="preserve">Recheck shift category configuration to ensure desk shifts are visible for non-transport users. Raise an SE ticket if  manual shift refresh is needed. Also check if the team is tagged to the right shift category under Manage teams section.</w:t>
+      </w:r>
+      <w:r>
+        <w:rPr>
+          <w:rtl w:val="0"/>
+        </w:rPr>
+      </w:r>
+    </w:p>
+    <w:p>
+      <w:pPr>
+        <w:spacing w:after="240" w:before="240" w:lineRule="auto"/>
+        <w:rPr>
+          <w:b w:val="1"/>
+          <w:bCs w:val="1"/>
+        </w:rPr>
+      </w:pPr>
+      <w:r>
+        <w:rPr>
+          <w:b w:val="1"/>
+          <w:bCs w:val="1"/>
+          <w:rtl w:val="0"/>
+        </w:rPr>
+        <w:t xml:space="preserve">4.10  Non Transport Shift appears as Transport Shift or Vice versa.</w:t>
+      </w:r>
+    </w:p>
+    <w:p>
+      <w:pPr>
+        <w:numPr>
+          <w:ilvl w:val="0"/>
+          <w:numId w:val="32"/>
+        </w:numPr>
+        <w:spacing w:after="0" w:before="240" w:lineRule="auto"/>
+        <w:ind w:left="720" w:hanging="360"/>
+        <w:rPr>
+          <w:b w:val="1"/>
+          <w:bCs w:val="1"/>
+        </w:rPr>
+      </w:pPr>
+      <w:r>
+        <w:rPr>
+          <w:b w:val="1"/>
+          <w:bCs w:val="1"/>
+          <w:rtl w:val="0"/>
+        </w:rPr>
+        <w:t xml:space="preserve">Issue: </w:t>
+      </w:r>
+      <w:r>
+        <w:rPr>
+          <w:rtl w:val="0"/>
+        </w:rPr>
+        <w:t xml:space="preserve">Incorrect Shift configuration.</w:t>
+      </w:r>
+      <w:r>
+        <w:rPr>
+          <w:rtl w:val="0"/>
+        </w:rPr>
+      </w:r>
+    </w:p>
+    <w:p>
+      <w:pPr>
+        <w:numPr>
+          <w:ilvl w:val="0"/>
+          <w:numId w:val="32"/>
+        </w:numPr>
+        <w:spacing w:after="240" w:before="0" w:lineRule="auto"/>
+        <w:ind w:left="720" w:hanging="360"/>
+        <w:rPr>
+          <w:b w:val="1"/>
+          <w:bCs w:val="1"/>
+        </w:rPr>
+      </w:pPr>
+      <w:r>
+        <w:rPr>
+          <w:b w:val="1"/>
+          <w:bCs w:val="1"/>
+          <w:rtl w:val="0"/>
+        </w:rPr>
+        <w:t xml:space="preserve">Action: </w:t>
+      </w:r>
+      <w:r>
+        <w:rPr>
+          <w:rtl w:val="0"/>
+        </w:rPr>
+        <w:t xml:space="preserve">Verify the shift configurations in the system and reassign transport users to the correct shift category. Consult the SE  for correct shift mapping.</w:t>
+      </w:r>
+      <w:r>
+        <w:rPr>
+          <w:rtl w:val="0"/>
+        </w:rPr>
+      </w:r>
+    </w:p>
+    <w:p>
+      <w:pPr>
+        <w:spacing w:after="240" w:before="240" w:lineRule="auto"/>
+        <w:rPr>
+          <w:b w:val="1"/>
+          <w:bCs w:val="1"/>
+        </w:rPr>
+      </w:pPr>
+      <w:r>
+        <w:rPr>
+          <w:rtl w:val="0"/>
+        </w:rPr>
+      </w:r>
+    </w:p>
+    <w:p>
+      <w:pPr>
+        <w:spacing w:after="240" w:before="240" w:lineRule="auto"/>
+        <w:rPr>
+          <w:b w:val="1"/>
+          <w:bCs w:val="1"/>
+        </w:rPr>
+      </w:pPr>
+      <w:r>
+        <w:rPr>
+          <w:rtl w:val="0"/>
+        </w:rPr>
+      </w:r>
+    </w:p>
+    <w:p>
+      <w:pPr>
+        <w:spacing w:after="240" w:before="240" w:lineRule="auto"/>
+        <w:rPr>
+          <w:b w:val="1"/>
+          <w:bCs w:val="1"/>
+        </w:rPr>
+      </w:pPr>
+      <w:r>
+        <w:rPr>
+          <w:b w:val="1"/>
+          <w:bCs w:val="1"/>
+          <w:rtl w:val="0"/>
+        </w:rPr>
+        <w:t xml:space="preserve">4.11 Floor Plan Not Visible on WIS</w:t>
+      </w:r>
+    </w:p>
+    <w:p>
+      <w:pPr>
+        <w:numPr>
+          <w:ilvl w:val="0"/>
+          <w:numId w:val="15"/>
+        </w:numPr>
+        <w:spacing w:after="0" w:before="240" w:lineRule="auto"/>
+        <w:ind w:left="720" w:hanging="360"/>
+        <w:rPr>
+          <w:b w:val="1"/>
+          <w:bCs w:val="1"/>
+        </w:rPr>
+      </w:pPr>
+      <w:r>
+        <w:rPr>
+          <w:b w:val="1"/>
+          <w:bCs w:val="1"/>
+          <w:rtl w:val="0"/>
+        </w:rPr>
+        <w:t xml:space="preserve">Issue: </w:t>
+      </w:r>
+      <w:r>
+        <w:rPr>
+          <w:rtl w:val="0"/>
+        </w:rPr>
+        <w:t xml:space="preserve">Floor plan not uploaded correctly.</w:t>
+      </w:r>
+      <w:r>
+        <w:rPr>
+          <w:rtl w:val="0"/>
+        </w:rPr>
+      </w:r>
+    </w:p>
+    <w:p>
+      <w:pPr>
+        <w:numPr>
+          <w:ilvl w:val="0"/>
+          <w:numId w:val="15"/>
+        </w:numPr>
+        <w:spacing w:after="240" w:before="0" w:lineRule="auto"/>
+        <w:ind w:left="720" w:hanging="360"/>
+        <w:rPr>
+          <w:b w:val="1"/>
+          <w:bCs w:val="1"/>
+        </w:rPr>
+      </w:pPr>
+      <w:r>
+        <w:rPr>
+          <w:b w:val="1"/>
+          <w:bCs w:val="1"/>
+          <w:rtl w:val="0"/>
+        </w:rPr>
+        <w:t xml:space="preserve">Action: </w:t>
+      </w:r>
+      <w:r>
+        <w:rPr>
+          <w:rtl w:val="0"/>
+        </w:rPr>
+        <w:t xml:space="preserve">Ensure the SE ticket to upload the floor plan is completed. Revalidate the plan on the platform and consult the Tech Team if it still fails to appear post SE Team confirmation.</w:t>
+        <w:br w:type="textWrapping"/>
+      </w:r>
+      <w:r>
+        <w:rPr>
+          <w:rtl w:val="0"/>
+        </w:rPr>
+      </w:r>
+    </w:p>
+    <w:p>
+      <w:pPr>
+        <w:spacing w:after="240" w:before="240" w:lineRule="auto"/>
+        <w:rPr>
+          <w:b w:val="1"/>
+          <w:bCs w:val="1"/>
+        </w:rPr>
+      </w:pPr>
+      <w:r>
+        <w:rPr>
+          <w:b w:val="1"/>
+          <w:bCs w:val="1"/>
+          <w:rtl w:val="0"/>
+        </w:rPr>
+        <w:t xml:space="preserve">4.12 Incorrect Parking Plan After Migration</w:t>
+      </w:r>
+    </w:p>
+    <w:p>
+      <w:pPr>
+        <w:numPr>
+          <w:ilvl w:val="0"/>
+          <w:numId w:val="37"/>
+        </w:numPr>
+        <w:spacing w:after="0" w:before="240" w:lineRule="auto"/>
+        <w:ind w:left="720" w:hanging="360"/>
+        <w:rPr>
+          <w:b w:val="1"/>
+          <w:bCs w:val="1"/>
+        </w:rPr>
+      </w:pPr>
+      <w:r>
+        <w:rPr>
+          <w:b w:val="1"/>
+          <w:bCs w:val="1"/>
+          <w:rtl w:val="0"/>
+        </w:rPr>
+        <w:t xml:space="preserve">Issue: </w:t>
+      </w:r>
+      <w:r>
+        <w:rPr>
+          <w:rtl w:val="0"/>
+        </w:rPr>
+        <w:t xml:space="preserve">Parking plan mismatches with actual parking assignments.</w:t>
+      </w:r>
+      <w:r>
+        <w:rPr>
+          <w:rtl w:val="0"/>
+        </w:rPr>
+      </w:r>
+    </w:p>
+    <w:p>
+      <w:pPr>
+        <w:numPr>
+          <w:ilvl w:val="0"/>
+          <w:numId w:val="37"/>
+        </w:numPr>
+        <w:spacing w:after="240" w:before="0" w:lineRule="auto"/>
+        <w:ind w:left="720" w:hanging="360"/>
+        <w:rPr>
+          <w:b w:val="1"/>
+          <w:bCs w:val="1"/>
+        </w:rPr>
+      </w:pPr>
+      <w:r>
+        <w:rPr>
+          <w:b w:val="1"/>
+          <w:bCs w:val="1"/>
+          <w:rtl w:val="0"/>
+        </w:rPr>
+        <w:t xml:space="preserve">Action: </w:t>
+      </w:r>
+      <w:r>
+        <w:rPr>
+          <w:rtl w:val="0"/>
+        </w:rPr>
+        <w:t xml:space="preserve">Verify that the correct parking plan was uploaded. If incorrect, raise a new SE ticket to re-upload the updated parking plan and ensure it reflects properly on the WIS platform.</w:t>
+      </w:r>
+      <w:r>
+        <w:rPr>
+          <w:rtl w:val="0"/>
+        </w:rPr>
+      </w:r>
+    </w:p>
+    <w:p>
+      <w:pPr>
+        <w:spacing w:after="240" w:before="240" w:lineRule="auto"/>
+        <w:rPr>
+          <w:b w:val="1"/>
+          <w:bCs w:val="1"/>
+        </w:rPr>
+      </w:pPr>
+      <w:r>
+        <w:rPr>
+          <w:b w:val="1"/>
+          <w:bCs w:val="1"/>
+          <w:rtl w:val="0"/>
+        </w:rPr>
+        <w:t xml:space="preserve">4.13 Users Not Receiving Transport Booking Notifications</w:t>
+      </w:r>
+    </w:p>
+    <w:p>
+      <w:pPr>
+        <w:numPr>
+          <w:ilvl w:val="0"/>
+          <w:numId w:val="23"/>
+        </w:numPr>
+        <w:spacing w:after="0" w:before="240" w:lineRule="auto"/>
+        <w:ind w:left="720" w:hanging="360"/>
+        <w:rPr>
+          <w:b w:val="1"/>
+          <w:bCs w:val="1"/>
+        </w:rPr>
+      </w:pPr>
+      <w:r>
+        <w:rPr>
+          <w:b w:val="1"/>
+          <w:bCs w:val="1"/>
+          <w:rtl w:val="0"/>
+        </w:rPr>
+        <w:t xml:space="preserve">Issue: </w:t>
+      </w:r>
+      <w:r>
+        <w:rPr>
+          <w:rtl w:val="0"/>
+        </w:rPr>
+        <w:t xml:space="preserve">Notification failure post-migration</w:t>
+      </w:r>
+      <w:r>
+        <w:rPr>
+          <w:b w:val="1"/>
+          <w:bCs w:val="1"/>
+          <w:rtl w:val="0"/>
+        </w:rPr>
+        <w:t xml:space="preserve">.</w:t>
+      </w:r>
+    </w:p>
+    <w:p>
+      <w:pPr>
+        <w:numPr>
+          <w:ilvl w:val="0"/>
+          <w:numId w:val="23"/>
+        </w:numPr>
+        <w:spacing w:after="240" w:before="0" w:lineRule="auto"/>
+        <w:ind w:left="720" w:hanging="360"/>
+        <w:rPr>
+          <w:b w:val="1"/>
+          <w:bCs w:val="1"/>
+        </w:rPr>
+      </w:pPr>
+      <w:r>
+        <w:rPr>
+          <w:b w:val="1"/>
+          <w:bCs w:val="1"/>
+          <w:rtl w:val="0"/>
+        </w:rPr>
+        <w:t xml:space="preserve">Action: </w:t>
+      </w:r>
+      <w:r>
+        <w:rPr>
+          <w:rtl w:val="0"/>
+        </w:rPr>
+        <w:t xml:space="preserve">Verify the notification settings in the system and ensure they are enabled for all users. Work with the Mobile App Team to ensure push notifications are functioning correctly.</w:t>
+      </w:r>
+      <w:r>
+        <w:rPr>
+          <w:rtl w:val="0"/>
+        </w:rPr>
+      </w:r>
+    </w:p>
+    <w:p>
+      <w:pPr>
+        <w:spacing w:after="240" w:before="240" w:lineRule="auto"/>
+        <w:rPr>
+          <w:b w:val="1"/>
+          <w:bCs w:val="1"/>
+        </w:rPr>
+      </w:pPr>
+      <w:r>
+        <w:rPr>
+          <w:b w:val="1"/>
+          <w:bCs w:val="1"/>
+          <w:rtl w:val="0"/>
+        </w:rPr>
+        <w:t xml:space="preserve">4.14 Bookings Showing Incorrect Time or Dates</w:t>
+      </w:r>
+    </w:p>
+    <w:p>
+      <w:pPr>
+        <w:numPr>
+          <w:ilvl w:val="0"/>
+          <w:numId w:val="6"/>
+        </w:numPr>
+        <w:spacing w:after="0" w:before="240" w:lineRule="auto"/>
+        <w:ind w:left="720" w:hanging="360"/>
+        <w:rPr>
+          <w:b w:val="1"/>
+          <w:bCs w:val="1"/>
+        </w:rPr>
+      </w:pPr>
+      <w:r>
+        <w:rPr>
+          <w:b w:val="1"/>
+          <w:bCs w:val="1"/>
+          <w:rtl w:val="0"/>
+        </w:rPr>
+        <w:t xml:space="preserve">Issue: </w:t>
+      </w:r>
+      <w:r>
+        <w:rPr>
+          <w:rtl w:val="0"/>
+        </w:rPr>
+        <w:t xml:space="preserve">Time/date mismatch for transport bookings</w:t>
+      </w:r>
+      <w:r>
+        <w:rPr>
+          <w:b w:val="1"/>
+          <w:bCs w:val="1"/>
+          <w:rtl w:val="0"/>
+        </w:rPr>
+        <w:t xml:space="preserve">.</w:t>
+      </w:r>
+    </w:p>
+    <w:p>
+      <w:pPr>
+        <w:numPr>
+          <w:ilvl w:val="0"/>
+          <w:numId w:val="6"/>
+        </w:numPr>
+        <w:spacing w:after="240" w:before="0" w:lineRule="auto"/>
+        <w:ind w:left="720" w:hanging="360"/>
+        <w:rPr>
+          <w:b w:val="1"/>
+          <w:bCs w:val="1"/>
+        </w:rPr>
+      </w:pPr>
+      <w:r>
+        <w:rPr>
+          <w:b w:val="1"/>
+          <w:bCs w:val="1"/>
+          <w:rtl w:val="0"/>
+        </w:rPr>
+        <w:t xml:space="preserve">Action: </w:t>
+      </w:r>
+      <w:r>
+        <w:rPr>
+          <w:rtl w:val="0"/>
+        </w:rPr>
+        <w:t xml:space="preserve">Investigate the source of the incorrect time or date, such as time zone settings or booking configurations. Work with the Tech Team to fix the issue. </w:t>
+      </w:r>
+      <w:r>
+        <w:rPr>
+          <w:highlight w:val="yellow"/>
+          <w:rtl w:val="0"/>
+        </w:rPr>
+        <w:t xml:space="preserve">This happens only for the International clients </w:t>
+      </w:r>
+      <w:r>
+        <w:rPr>
+          <w:rtl w:val="0"/>
+        </w:rPr>
+      </w:r>
+    </w:p>
+    <w:p>
+      <w:pPr>
+        <w:spacing w:after="240" w:before="240" w:lineRule="auto"/>
+        <w:rPr>
+          <w:b w:val="1"/>
+          <w:bCs w:val="1"/>
+        </w:rPr>
+      </w:pPr>
+      <w:r>
+        <w:rPr>
+          <w:b w:val="1"/>
+          <w:bCs w:val="1"/>
+          <w:rtl w:val="0"/>
+        </w:rPr>
+        <w:t xml:space="preserve">4.15 Transport Availability Not Matching Operations Study</w:t>
+      </w:r>
+    </w:p>
+    <w:p>
+      <w:pPr>
+        <w:numPr>
+          <w:ilvl w:val="0"/>
+          <w:numId w:val="4"/>
+        </w:numPr>
+        <w:spacing w:after="0" w:before="240" w:lineRule="auto"/>
+        <w:ind w:left="720" w:hanging="360"/>
+        <w:rPr>
+          <w:b w:val="1"/>
+          <w:bCs w:val="1"/>
+        </w:rPr>
+      </w:pPr>
+      <w:r>
+        <w:rPr>
+          <w:b w:val="1"/>
+          <w:bCs w:val="1"/>
+          <w:rtl w:val="0"/>
+        </w:rPr>
+        <w:t xml:space="preserve">Issue: </w:t>
+      </w:r>
+      <w:r>
+        <w:rPr>
+          <w:rtl w:val="0"/>
+        </w:rPr>
+        <w:t xml:space="preserve">Incorrect configuration of Shift in shift category page.</w:t>
+      </w:r>
+      <w:r>
+        <w:rPr>
+          <w:rtl w:val="0"/>
+        </w:rPr>
+      </w:r>
+    </w:p>
+    <w:p>
+      <w:pPr>
+        <w:numPr>
+          <w:ilvl w:val="0"/>
+          <w:numId w:val="4"/>
+        </w:numPr>
+        <w:spacing w:after="240" w:before="0" w:lineRule="auto"/>
+        <w:ind w:left="720" w:hanging="360"/>
+        <w:rPr>
+          <w:b w:val="1"/>
+          <w:bCs w:val="1"/>
+        </w:rPr>
+      </w:pPr>
+      <w:r>
+        <w:rPr>
+          <w:b w:val="1"/>
+          <w:bCs w:val="1"/>
+          <w:rtl w:val="0"/>
+        </w:rPr>
+        <w:t xml:space="preserve">Action: </w:t>
+      </w:r>
+      <w:r>
+        <w:rPr>
+          <w:rtl w:val="0"/>
+        </w:rPr>
+        <w:t xml:space="preserve">Cross-check the transport shift timings with the operational study document. Make necessary adjustments in the system or consult the SE Team for configuration updates.</w:t>
+      </w:r>
+      <w:r>
+        <w:rPr>
+          <w:rtl w:val="0"/>
+        </w:rPr>
+      </w:r>
+    </w:p>
+    <w:p>
+      <w:pPr>
+        <w:spacing w:after="240" w:before="240" w:lineRule="auto"/>
+        <w:rPr>
+          <w:b w:val="1"/>
+          <w:bCs w:val="1"/>
+        </w:rPr>
+      </w:pPr>
+      <w:r>
+        <w:rPr>
+          <w:b w:val="1"/>
+          <w:bCs w:val="1"/>
+          <w:rtl w:val="0"/>
+        </w:rPr>
+        <w:t xml:space="preserve">4.16 Duplicate Bookings Showing on Mobile App</w:t>
+      </w:r>
+    </w:p>
+    <w:p>
+      <w:pPr>
+        <w:numPr>
+          <w:ilvl w:val="0"/>
+          <w:numId w:val="12"/>
+        </w:numPr>
+        <w:spacing w:after="0" w:before="240" w:lineRule="auto"/>
+        <w:ind w:left="720" w:hanging="360"/>
+        <w:rPr>
+          <w:b w:val="1"/>
+          <w:bCs w:val="1"/>
+        </w:rPr>
+      </w:pPr>
+      <w:r>
+        <w:rPr>
+          <w:b w:val="1"/>
+          <w:bCs w:val="1"/>
+          <w:rtl w:val="0"/>
+        </w:rPr>
+        <w:t xml:space="preserve">Issue: </w:t>
+      </w:r>
+      <w:r>
+        <w:rPr>
+          <w:color w:val="ff0000"/>
+          <w:rtl w:val="0"/>
+        </w:rPr>
+        <w:t xml:space="preserve">Duplicate bookings for users. (Serious operational issue)</w:t>
+      </w:r>
+      <w:r>
+        <w:rPr>
+          <w:rtl w:val="0"/>
+        </w:rPr>
+      </w:r>
+    </w:p>
+    <w:p>
+      <w:pPr>
+        <w:numPr>
+          <w:ilvl w:val="0"/>
+          <w:numId w:val="12"/>
+        </w:numPr>
+        <w:spacing w:after="240" w:before="0" w:lineRule="auto"/>
+        <w:ind w:left="720" w:hanging="360"/>
+        <w:rPr>
+          <w:b w:val="1"/>
+          <w:bCs w:val="1"/>
+        </w:rPr>
+      </w:pPr>
+      <w:r>
+        <w:rPr>
+          <w:b w:val="1"/>
+          <w:bCs w:val="1"/>
+          <w:rtl w:val="0"/>
+        </w:rPr>
+        <w:t xml:space="preserve">Action: </w:t>
+      </w:r>
+      <w:r>
+        <w:rPr>
+          <w:rtl w:val="0"/>
+        </w:rPr>
+        <w:t xml:space="preserve">Identify the cause of duplicate entries in the migration logs. Have the Tech Team clean up the duplicate bookings from the system.</w:t>
+      </w:r>
+      <w:r>
+        <w:rPr>
+          <w:rtl w:val="0"/>
+        </w:rPr>
+      </w:r>
+    </w:p>
+    <w:p>
+      <w:pPr>
+        <w:spacing w:after="240" w:before="240" w:lineRule="auto"/>
+        <w:rPr>
+          <w:b w:val="1"/>
+          <w:bCs w:val="1"/>
+        </w:rPr>
+      </w:pPr>
+      <w:r>
+        <w:rPr>
+          <w:rtl w:val="0"/>
+        </w:rPr>
+      </w:r>
+    </w:p>
+    <w:p>
+      <w:pPr>
+        <w:spacing w:after="240" w:before="240" w:lineRule="auto"/>
+        <w:rPr>
+          <w:b w:val="1"/>
+          <w:bCs w:val="1"/>
+        </w:rPr>
+      </w:pPr>
+      <w:r>
+        <w:rPr>
+          <w:b w:val="1"/>
+          <w:bCs w:val="1"/>
+          <w:rtl w:val="0"/>
+        </w:rPr>
+        <w:t xml:space="preserve">4.17 App Crashes During Booking Process</w:t>
       </w:r>
     </w:p>
     <w:p>
@@ -2238,7 +3131,7 @@
           <w:ilvl w:val="0"/>
           <w:numId w:val="25"/>
         </w:numPr>
-        <w:spacing w:after="0" w:afterAutospacing="0" w:before="240" w:lineRule="auto"/>
+        <w:spacing w:after="0" w:before="240" w:lineRule="auto"/>
         <w:ind w:left="720" w:hanging="360"/>
         <w:rPr>
           <w:b w:val="1"/>
@@ -2257,7 +3150,12 @@
         <w:rPr>
           <w:rtl w:val="0"/>
         </w:rPr>
-        <w:t xml:space="preserve">Non-transport user shifts not configured properly or shift refresh issue</w:t>
+        <w:t xml:space="preserve">App instability during transport booking.</w:t>
+      </w:r>
+      <w:r>
+        <w:rPr>
+          <w:rtl w:val="0"/>
+        </w:rPr>
       </w:r>
     </w:p>
     <w:p>
@@ -2266,658 +3164,7 @@
           <w:ilvl w:val="0"/>
           <w:numId w:val="25"/>
         </w:numPr>
-        <w:spacing w:after="240" w:before="0" w:beforeAutospacing="0" w:lineRule="auto"/>
-        <w:ind w:left="720" w:hanging="360"/>
-        <w:rPr>
-          <w:b w:val="1"/>
-          <w:bCs w:val="1"/>
-        </w:rPr>
-      </w:pPr>
-      <w:r>
-        <w:rPr>
-          <w:b w:val="1"/>
-          <w:bCs w:val="1"/>
-          <w:rtl w:val="0"/>
-        </w:rPr>
-        <w:t xml:space="preserve">Action: </w:t>
-      </w:r>
-      <w:r>
-        <w:rPr>
-          <w:rtl w:val="0"/>
-        </w:rPr>
-        <w:t xml:space="preserve">Recheck shift category configuration to ensure desk shifts are visible for non-transport users. Raise an SE ticket if  manual shift refresh is needed. Also check if the team is tagged to the right shift category under Manage teams section.</w:t>
-      </w:r>
-    </w:p>
-    <w:p>
-      <w:pPr>
-        <w:spacing w:after="240" w:before="240" w:lineRule="auto"/>
-        <w:rPr>
-          <w:b w:val="1"/>
-          <w:bCs w:val="1"/>
-        </w:rPr>
-      </w:pPr>
-      <w:r>
-        <w:rPr>
-          <w:b w:val="1"/>
-          <w:bCs w:val="1"/>
-          <w:rtl w:val="0"/>
-        </w:rPr>
-        <w:t xml:space="preserve">4.10  Non Transport Shift appears as Transport Shift or Vice versa.</w:t>
-      </w:r>
-    </w:p>
-    <w:p>
-      <w:pPr>
-        <w:numPr>
-          <w:ilvl w:val="0"/>
-          <w:numId w:val="38"/>
-        </w:numPr>
-        <w:spacing w:after="0" w:afterAutospacing="0" w:before="240" w:lineRule="auto"/>
-        <w:ind w:left="720" w:hanging="360"/>
-        <w:rPr>
-          <w:b w:val="1"/>
-          <w:bCs w:val="1"/>
-        </w:rPr>
-      </w:pPr>
-      <w:r>
-        <w:rPr>
-          <w:b w:val="1"/>
-          <w:bCs w:val="1"/>
-          <w:rtl w:val="0"/>
-        </w:rPr>
-        <w:t xml:space="preserve">Issue: </w:t>
-      </w:r>
-      <w:r>
-        <w:rPr>
-          <w:rtl w:val="0"/>
-        </w:rPr>
-        <w:t xml:space="preserve">Incorrect Shift configuration.</w:t>
-      </w:r>
-    </w:p>
-    <w:p>
-      <w:pPr>
-        <w:numPr>
-          <w:ilvl w:val="0"/>
-          <w:numId w:val="38"/>
-        </w:numPr>
-        <w:spacing w:after="240" w:before="0" w:beforeAutospacing="0" w:lineRule="auto"/>
-        <w:ind w:left="720" w:hanging="360"/>
-        <w:rPr>
-          <w:b w:val="1"/>
-          <w:bCs w:val="1"/>
-        </w:rPr>
-      </w:pPr>
-      <w:r>
-        <w:rPr>
-          <w:b w:val="1"/>
-          <w:bCs w:val="1"/>
-          <w:rtl w:val="0"/>
-        </w:rPr>
-        <w:t xml:space="preserve">Action: </w:t>
-      </w:r>
-      <w:r>
-        <w:rPr>
-          <w:rtl w:val="0"/>
-        </w:rPr>
-        <w:t xml:space="preserve">Verify the shift configurations in the system and reassign transport users to the correct shift category. Consult the SE  for correct shift mapping.</w:t>
-      </w:r>
-    </w:p>
-    <w:p>
-      <w:pPr>
-        <w:spacing w:after="240" w:before="240" w:lineRule="auto"/>
-        <w:rPr>
-          <w:b w:val="1"/>
-          <w:bCs w:val="1"/>
-        </w:rPr>
-      </w:pPr>
-      <w:r>
-        <w:rPr>
-          <w:rtl w:val="0"/>
-        </w:rPr>
-      </w:r>
-    </w:p>
-    <w:p>
-      <w:pPr>
-        <w:spacing w:after="240" w:before="240" w:lineRule="auto"/>
-        <w:rPr>
-          <w:b w:val="1"/>
-          <w:bCs w:val="1"/>
-        </w:rPr>
-      </w:pPr>
-      <w:r>
-        <w:rPr>
-          <w:rtl w:val="0"/>
-        </w:rPr>
-      </w:r>
-    </w:p>
-    <w:p>
-      <w:pPr>
-        <w:spacing w:after="240" w:before="240" w:lineRule="auto"/>
-        <w:rPr>
-          <w:b w:val="1"/>
-          <w:bCs w:val="1"/>
-        </w:rPr>
-      </w:pPr>
-      <w:r>
-        <w:rPr>
-          <w:b w:val="1"/>
-          <w:bCs w:val="1"/>
-          <w:rtl w:val="0"/>
-        </w:rPr>
-        <w:t xml:space="preserve">4.11 Floor Plan Not Visible on WIS</w:t>
-      </w:r>
-    </w:p>
-    <w:p>
-      <w:pPr>
-        <w:numPr>
-          <w:ilvl w:val="0"/>
-          <w:numId w:val="22"/>
-        </w:numPr>
-        <w:spacing w:after="0" w:afterAutospacing="0" w:before="240" w:lineRule="auto"/>
-        <w:ind w:left="720" w:hanging="360"/>
-        <w:rPr>
-          <w:b w:val="1"/>
-          <w:bCs w:val="1"/>
-        </w:rPr>
-      </w:pPr>
-      <w:r>
-        <w:rPr>
-          <w:b w:val="1"/>
-          <w:bCs w:val="1"/>
-          <w:rtl w:val="0"/>
-        </w:rPr>
-        <w:t xml:space="preserve">Issue: </w:t>
-      </w:r>
-      <w:r>
-        <w:rPr>
-          <w:rtl w:val="0"/>
-        </w:rPr>
-        <w:t xml:space="preserve">Floor plan not uploaded correctly.</w:t>
-      </w:r>
-    </w:p>
-    <w:p>
-      <w:pPr>
-        <w:numPr>
-          <w:ilvl w:val="0"/>
-          <w:numId w:val="22"/>
-        </w:numPr>
-        <w:spacing w:after="240" w:before="0" w:beforeAutospacing="0" w:lineRule="auto"/>
-        <w:ind w:left="720" w:hanging="360"/>
-        <w:rPr>
-          <w:b w:val="1"/>
-          <w:bCs w:val="1"/>
-        </w:rPr>
-      </w:pPr>
-      <w:r>
-        <w:rPr>
-          <w:b w:val="1"/>
-          <w:bCs w:val="1"/>
-          <w:rtl w:val="0"/>
-        </w:rPr>
-        <w:t xml:space="preserve">Action: </w:t>
-      </w:r>
-      <w:r>
-        <w:rPr>
-          <w:rtl w:val="0"/>
-        </w:rPr>
-        <w:t xml:space="preserve">Ensure the SE ticket to upload the floor plan is completed. Revalidate the plan on the platform and consult the Tech Team if it still fails to appear post SE Team confirmation.</w:t>
-        <w:br w:type="textWrapping"/>
-      </w:r>
-    </w:p>
-    <w:p>
-      <w:pPr>
-        <w:spacing w:after="240" w:before="240" w:lineRule="auto"/>
-        <w:rPr>
-          <w:b w:val="1"/>
-          <w:bCs w:val="1"/>
-        </w:rPr>
-      </w:pPr>
-      <w:r>
-        <w:rPr>
-          <w:b w:val="1"/>
-          <w:bCs w:val="1"/>
-          <w:rtl w:val="0"/>
-        </w:rPr>
-        <w:t xml:space="preserve">4.12 Incorrect Parking Plan After Migration</w:t>
-      </w:r>
-    </w:p>
-    <w:p>
-      <w:pPr>
-        <w:numPr>
-          <w:ilvl w:val="0"/>
-          <w:numId w:val="6"/>
-        </w:numPr>
-        <w:spacing w:after="0" w:afterAutospacing="0" w:before="240" w:lineRule="auto"/>
-        <w:ind w:left="720" w:hanging="360"/>
-        <w:rPr>
-          <w:b w:val="1"/>
-          <w:bCs w:val="1"/>
-        </w:rPr>
-      </w:pPr>
-      <w:r>
-        <w:rPr>
-          <w:b w:val="1"/>
-          <w:bCs w:val="1"/>
-          <w:rtl w:val="0"/>
-        </w:rPr>
-        <w:t xml:space="preserve">Issue: </w:t>
-      </w:r>
-      <w:r>
-        <w:rPr>
-          <w:rtl w:val="0"/>
-        </w:rPr>
-        <w:t xml:space="preserve">Parking plan mismatches with actual parking assignments.</w:t>
-      </w:r>
-    </w:p>
-    <w:p>
-      <w:pPr>
-        <w:numPr>
-          <w:ilvl w:val="0"/>
-          <w:numId w:val="6"/>
-        </w:numPr>
-        <w:spacing w:after="240" w:before="0" w:beforeAutospacing="0" w:lineRule="auto"/>
-        <w:ind w:left="720" w:hanging="360"/>
-        <w:rPr>
-          <w:b w:val="1"/>
-          <w:bCs w:val="1"/>
-        </w:rPr>
-      </w:pPr>
-      <w:r>
-        <w:rPr>
-          <w:b w:val="1"/>
-          <w:bCs w:val="1"/>
-          <w:rtl w:val="0"/>
-        </w:rPr>
-        <w:t xml:space="preserve">Action: </w:t>
-      </w:r>
-      <w:r>
-        <w:rPr>
-          <w:rtl w:val="0"/>
-        </w:rPr>
-        <w:t xml:space="preserve">Verify that the correct parking plan was uploaded. If incorrect, raise a new SE ticket to re-upload the updated parking plan and ensure it reflects properly on the WIS platform.</w:t>
-      </w:r>
-    </w:p>
-    <w:p>
-      <w:pPr>
-        <w:spacing w:after="240" w:before="240" w:lineRule="auto"/>
-        <w:rPr>
-          <w:b w:val="1"/>
-          <w:bCs w:val="1"/>
-        </w:rPr>
-      </w:pPr>
-      <w:r>
-        <w:rPr>
-          <w:b w:val="1"/>
-          <w:bCs w:val="1"/>
-          <w:rtl w:val="0"/>
-        </w:rPr>
-        <w:t xml:space="preserve">4.13 Users Not Receiving Transport Booking Notifications</w:t>
-      </w:r>
-    </w:p>
-    <w:p>
-      <w:pPr>
-        <w:numPr>
-          <w:ilvl w:val="0"/>
-          <w:numId w:val="3"/>
-        </w:numPr>
-        <w:spacing w:after="0" w:afterAutospacing="0" w:before="240" w:lineRule="auto"/>
-        <w:ind w:left="720" w:hanging="360"/>
-        <w:rPr>
-          <w:b w:val="1"/>
-          <w:bCs w:val="1"/>
-        </w:rPr>
-      </w:pPr>
-      <w:r>
-        <w:rPr>
-          <w:b w:val="1"/>
-          <w:bCs w:val="1"/>
-          <w:rtl w:val="0"/>
-        </w:rPr>
-        <w:t xml:space="preserve">Issue: </w:t>
-      </w:r>
-      <w:r>
-        <w:rPr>
-          <w:rtl w:val="0"/>
-        </w:rPr>
-        <w:t xml:space="preserve">Notification failure post-migration</w:t>
-      </w:r>
-      <w:r>
-        <w:rPr>
-          <w:b w:val="1"/>
-          <w:bCs w:val="1"/>
-          <w:rtl w:val="0"/>
-        </w:rPr>
-        <w:t xml:space="preserve">.</w:t>
-      </w:r>
-    </w:p>
-    <w:p>
-      <w:pPr>
-        <w:numPr>
-          <w:ilvl w:val="0"/>
-          <w:numId w:val="3"/>
-        </w:numPr>
-        <w:spacing w:after="240" w:before="0" w:beforeAutospacing="0" w:lineRule="auto"/>
-        <w:ind w:left="720" w:hanging="360"/>
-        <w:rPr>
-          <w:b w:val="1"/>
-          <w:bCs w:val="1"/>
-        </w:rPr>
-      </w:pPr>
-      <w:r>
-        <w:rPr>
-          <w:b w:val="1"/>
-          <w:bCs w:val="1"/>
-          <w:rtl w:val="0"/>
-        </w:rPr>
-        <w:t xml:space="preserve">Action: </w:t>
-      </w:r>
-      <w:r>
-        <w:rPr>
-          <w:rtl w:val="0"/>
-        </w:rPr>
-        <w:t xml:space="preserve">Verify the notification settings in the system and ensure they are enabled for all users. Work with the Mobile App Team to ensure push notifications are functioning correctly.</w:t>
-      </w:r>
-    </w:p>
-    <w:p>
-      <w:pPr>
-        <w:spacing w:after="240" w:before="240" w:lineRule="auto"/>
-        <w:rPr>
-          <w:b w:val="1"/>
-          <w:bCs w:val="1"/>
-        </w:rPr>
-      </w:pPr>
-      <w:r>
-        <w:rPr>
-          <w:b w:val="1"/>
-          <w:bCs w:val="1"/>
-          <w:rtl w:val="0"/>
-        </w:rPr>
-        <w:t xml:space="preserve">4.14 Bookings Showing Incorrect Time or Dates</w:t>
-      </w:r>
-    </w:p>
-    <w:p>
-      <w:pPr>
-        <w:numPr>
-          <w:ilvl w:val="0"/>
-          <w:numId w:val="14"/>
-        </w:numPr>
-        <w:spacing w:after="0" w:afterAutospacing="0" w:before="240" w:lineRule="auto"/>
-        <w:ind w:left="720" w:hanging="360"/>
-        <w:rPr>
-          <w:b w:val="1"/>
-          <w:bCs w:val="1"/>
-        </w:rPr>
-      </w:pPr>
-      <w:r>
-        <w:rPr>
-          <w:b w:val="1"/>
-          <w:bCs w:val="1"/>
-          <w:rtl w:val="0"/>
-        </w:rPr>
-        <w:t xml:space="preserve">Issue: </w:t>
-      </w:r>
-      <w:r>
-        <w:rPr>
-          <w:rtl w:val="0"/>
-        </w:rPr>
-        <w:t xml:space="preserve">Time/date mismatch for transport bookings</w:t>
-      </w:r>
-      <w:r>
-        <w:rPr>
-          <w:b w:val="1"/>
-          <w:bCs w:val="1"/>
-          <w:rtl w:val="0"/>
-        </w:rPr>
-        <w:t xml:space="preserve">.</w:t>
-      </w:r>
-    </w:p>
-    <w:p>
-      <w:pPr>
-        <w:numPr>
-          <w:ilvl w:val="0"/>
-          <w:numId w:val="14"/>
-        </w:numPr>
-        <w:spacing w:after="240" w:before="0" w:beforeAutospacing="0" w:lineRule="auto"/>
-        <w:ind w:left="720" w:hanging="360"/>
-        <w:rPr>
-          <w:b w:val="1"/>
-          <w:bCs w:val="1"/>
-        </w:rPr>
-      </w:pPr>
-      <w:r>
-        <w:rPr>
-          <w:b w:val="1"/>
-          <w:bCs w:val="1"/>
-          <w:rtl w:val="0"/>
-        </w:rPr>
-        <w:t xml:space="preserve">Action: </w:t>
-      </w:r>
-      <w:r>
-        <w:rPr>
-          <w:rtl w:val="0"/>
-        </w:rPr>
-        <w:t xml:space="preserve">Investigate the source of the incorrect time or date, such as time zone settings or booking configurations. Work with the Tech Team to fix the issue. </w:t>
-      </w:r>
-      <w:r>
-        <w:rPr>
-          <w:highlight w:val="yellow"/>
-          <w:rtl w:val="0"/>
-        </w:rPr>
-        <w:t xml:space="preserve">This happens only for the International clients </w:t>
-      </w:r>
-    </w:p>
-    <w:p>
-      <w:pPr>
-        <w:spacing w:after="240" w:before="240" w:lineRule="auto"/>
-        <w:rPr>
-          <w:b w:val="1"/>
-          <w:bCs w:val="1"/>
-        </w:rPr>
-      </w:pPr>
-      <w:r>
-        <w:rPr>
-          <w:b w:val="1"/>
-          <w:bCs w:val="1"/>
-          <w:rtl w:val="0"/>
-        </w:rPr>
-        <w:t xml:space="preserve">4.15 Transport Availability Not Matching Operations Study</w:t>
-      </w:r>
-    </w:p>
-    <w:p>
-      <w:pPr>
-        <w:numPr>
-          <w:ilvl w:val="0"/>
-          <w:numId w:val="12"/>
-        </w:numPr>
-        <w:spacing w:after="0" w:afterAutospacing="0" w:before="240" w:lineRule="auto"/>
-        <w:ind w:left="720" w:hanging="360"/>
-        <w:rPr>
-          <w:b w:val="1"/>
-          <w:bCs w:val="1"/>
-        </w:rPr>
-      </w:pPr>
-      <w:r>
-        <w:rPr>
-          <w:b w:val="1"/>
-          <w:bCs w:val="1"/>
-          <w:rtl w:val="0"/>
-        </w:rPr>
-        <w:t xml:space="preserve">Issue: </w:t>
-      </w:r>
-      <w:r>
-        <w:rPr>
-          <w:rtl w:val="0"/>
-        </w:rPr>
-        <w:t xml:space="preserve">Incorrect configuration of Shift in shift category page.</w:t>
-      </w:r>
-    </w:p>
-    <w:p>
-      <w:pPr>
-        <w:numPr>
-          <w:ilvl w:val="0"/>
-          <w:numId w:val="12"/>
-        </w:numPr>
-        <w:spacing w:after="240" w:before="0" w:beforeAutospacing="0" w:lineRule="auto"/>
-        <w:ind w:left="720" w:hanging="360"/>
-        <w:rPr>
-          <w:b w:val="1"/>
-          <w:bCs w:val="1"/>
-        </w:rPr>
-      </w:pPr>
-      <w:r>
-        <w:rPr>
-          <w:b w:val="1"/>
-          <w:bCs w:val="1"/>
-          <w:rtl w:val="0"/>
-        </w:rPr>
-        <w:t xml:space="preserve">Action: </w:t>
-      </w:r>
-      <w:r>
-        <w:rPr>
-          <w:rtl w:val="0"/>
-        </w:rPr>
-        <w:t xml:space="preserve">Cross-check the transport shift timings with the operational study document. Make necessary adjustments in the system or consult the SE Team for configuration updates.</w:t>
-      </w:r>
-    </w:p>
-    <w:p>
-      <w:pPr>
-        <w:spacing w:after="240" w:before="240" w:lineRule="auto"/>
-        <w:rPr>
-          <w:b w:val="1"/>
-          <w:bCs w:val="1"/>
-        </w:rPr>
-      </w:pPr>
-      <w:r>
-        <w:rPr>
-          <w:b w:val="1"/>
-          <w:bCs w:val="1"/>
-          <w:rtl w:val="0"/>
-        </w:rPr>
-        <w:t xml:space="preserve">4.16 Duplicate Bookings Showing on Mobile App</w:t>
-      </w:r>
-    </w:p>
-    <w:p>
-      <w:pPr>
-        <w:numPr>
-          <w:ilvl w:val="0"/>
-          <w:numId w:val="2"/>
-        </w:numPr>
-        <w:spacing w:after="0" w:afterAutospacing="0" w:before="240" w:lineRule="auto"/>
-        <w:ind w:left="720" w:hanging="360"/>
-        <w:rPr>
-          <w:b w:val="1"/>
-          <w:bCs w:val="1"/>
-        </w:rPr>
-      </w:pPr>
-      <w:r>
-        <w:rPr>
-          <w:b w:val="1"/>
-          <w:bCs w:val="1"/>
-          <w:rtl w:val="0"/>
-        </w:rPr>
-        <w:t xml:space="preserve">Issue: </w:t>
-      </w:r>
-      <w:r>
-        <w:rPr>
-          <w:color w:val="ff0000"/>
-          <w:rtl w:val="0"/>
-        </w:rPr>
-        <w:t xml:space="preserve">Duplicate bookings for users. (Serious operational issue)</w:t>
-      </w:r>
-    </w:p>
-    <w:p>
-      <w:pPr>
-        <w:numPr>
-          <w:ilvl w:val="0"/>
-          <w:numId w:val="2"/>
-        </w:numPr>
-        <w:spacing w:after="240" w:before="0" w:beforeAutospacing="0" w:lineRule="auto"/>
-        <w:ind w:left="720" w:hanging="360"/>
-        <w:rPr>
-          <w:b w:val="1"/>
-          <w:bCs w:val="1"/>
-        </w:rPr>
-      </w:pPr>
-      <w:r>
-        <w:rPr>
-          <w:b w:val="1"/>
-          <w:bCs w:val="1"/>
-          <w:rtl w:val="0"/>
-        </w:rPr>
-        <w:t xml:space="preserve">Action: </w:t>
-      </w:r>
-      <w:r>
-        <w:rPr>
-          <w:rtl w:val="0"/>
-        </w:rPr>
-        <w:t xml:space="preserve">Identify the cause of duplicate entries in the migration logs. Have the Tech Team clean up the duplicate bookings from the system.</w:t>
-      </w:r>
-    </w:p>
-    <w:p>
-      <w:pPr>
-        <w:spacing w:after="240" w:before="240" w:lineRule="auto"/>
-        <w:rPr>
-          <w:b w:val="1"/>
-          <w:bCs w:val="1"/>
-        </w:rPr>
-      </w:pPr>
-      <w:r>
-        <w:rPr>
-          <w:rtl w:val="0"/>
-        </w:rPr>
-      </w:r>
-    </w:p>
-    <w:p>
-      <w:pPr>
-        <w:spacing w:after="240" w:before="240" w:lineRule="auto"/>
-        <w:rPr>
-          <w:b w:val="1"/>
-          <w:bCs w:val="1"/>
-        </w:rPr>
-      </w:pPr>
-      <w:r>
-        <w:rPr>
-          <w:b w:val="1"/>
-          <w:bCs w:val="1"/>
-          <w:rtl w:val="0"/>
-        </w:rPr>
-        <w:t xml:space="preserve">4.17 App Crashes During Booking Process</w:t>
-      </w:r>
-    </w:p>
-    <w:p>
-      <w:pPr>
-        <w:numPr>
-          <w:ilvl w:val="0"/>
-          <w:numId w:val="31"/>
-        </w:numPr>
-        <w:spacing w:after="0" w:afterAutospacing="0" w:before="240" w:lineRule="auto"/>
-        <w:ind w:left="720" w:hanging="360"/>
-        <w:rPr>
-          <w:b w:val="1"/>
-          <w:bCs w:val="1"/>
-        </w:rPr>
-      </w:pPr>
-      <w:r>
-        <w:rPr>
-          <w:b w:val="1"/>
-          <w:bCs w:val="1"/>
-          <w:rtl w:val="0"/>
-        </w:rPr>
-        <w:t xml:space="preserve">Issue: </w:t>
-      </w:r>
-      <w:r>
-        <w:rPr>
-          <w:rtl w:val="0"/>
-        </w:rPr>
-        <w:t xml:space="preserve">App instability during transport booking.</w:t>
-      </w:r>
-    </w:p>
-    <w:p>
-      <w:pPr>
-        <w:numPr>
-          <w:ilvl w:val="0"/>
-          <w:numId w:val="31"/>
-        </w:numPr>
-        <w:spacing w:after="240" w:before="0" w:beforeAutospacing="0" w:lineRule="auto"/>
+        <w:spacing w:after="240" w:before="0" w:lineRule="auto"/>
         <w:ind w:left="720" w:hanging="360"/>
         <w:rPr>
           <w:b w:val="1"/>
@@ -3000,6 +3247,11 @@
         <w:br w:type="textWrapping"/>
         <w:t xml:space="preserve">Affect user credentials : If possible (If its a test profile)</w:t>
       </w:r>
+      <w:r>
+        <w:rPr>
+          <w:rtl w:val="0"/>
+        </w:rPr>
+      </w:r>
     </w:p>
     <w:p>
       <w:pPr>
@@ -3023,9 +3275,9 @@
       <w:pPr>
         <w:numPr>
           <w:ilvl w:val="0"/>
-          <w:numId w:val="35"/>
-        </w:numPr>
-        <w:spacing w:after="0" w:afterAutospacing="0" w:before="240" w:lineRule="auto"/>
+          <w:numId w:val="29"/>
+        </w:numPr>
+        <w:spacing w:after="0" w:before="240" w:lineRule="auto"/>
         <w:ind w:left="720" w:hanging="360"/>
         <w:rPr>
           <w:b w:val="1"/>
@@ -3045,6 +3297,310 @@
           <w:rtl w:val="0"/>
         </w:rPr>
         <w:t xml:space="preserve">Configuration backup not completed by SE team before migration.</w:t>
+      </w:r>
+      <w:r>
+        <w:rPr>
+          <w:rtl w:val="0"/>
+        </w:rPr>
+      </w:r>
+    </w:p>
+    <w:p>
+      <w:pPr>
+        <w:numPr>
+          <w:ilvl w:val="0"/>
+          <w:numId w:val="29"/>
+        </w:numPr>
+        <w:spacing w:after="240" w:before="0" w:lineRule="auto"/>
+        <w:ind w:left="720" w:hanging="360"/>
+        <w:rPr>
+          <w:b w:val="1"/>
+          <w:bCs w:val="1"/>
+        </w:rPr>
+      </w:pPr>
+      <w:r>
+        <w:rPr>
+          <w:b w:val="1"/>
+          <w:bCs w:val="1"/>
+          <w:rtl w:val="0"/>
+        </w:rPr>
+        <w:t xml:space="preserve">Action: </w:t>
+      </w:r>
+      <w:r>
+        <w:rPr>
+          <w:rtl w:val="0"/>
+        </w:rPr>
+        <w:t xml:space="preserve">Raise an Blocker SE ticket to back up the system's current configuration and prevent any potential operational issue. Ensure future testing does not proceed without this configuration completed.</w:t>
+      </w:r>
+      <w:r>
+        <w:rPr>
+          <w:rtl w:val="0"/>
+        </w:rPr>
+      </w:r>
+    </w:p>
+    <w:p>
+      <w:pPr>
+        <w:spacing w:after="240" w:before="240" w:lineRule="auto"/>
+        <w:rPr>
+          <w:b w:val="1"/>
+          <w:bCs w:val="1"/>
+        </w:rPr>
+      </w:pPr>
+      <w:r>
+        <w:rPr>
+          <w:b w:val="1"/>
+          <w:bCs w:val="1"/>
+          <w:rtl w:val="0"/>
+        </w:rPr>
+        <w:t xml:space="preserve">4.19 Available Desk Booking Failing</w:t>
+      </w:r>
+    </w:p>
+    <w:p>
+      <w:pPr>
+        <w:numPr>
+          <w:ilvl w:val="0"/>
+          <w:numId w:val="28"/>
+        </w:numPr>
+        <w:spacing w:after="0" w:before="240" w:lineRule="auto"/>
+        <w:ind w:left="720" w:hanging="360"/>
+        <w:rPr>
+          <w:b w:val="1"/>
+          <w:bCs w:val="1"/>
+        </w:rPr>
+      </w:pPr>
+      <w:r>
+        <w:rPr>
+          <w:b w:val="1"/>
+          <w:bCs w:val="1"/>
+          <w:rtl w:val="0"/>
+        </w:rPr>
+        <w:t xml:space="preserve">Issue: </w:t>
+      </w:r>
+      <w:r>
+        <w:rPr>
+          <w:rtl w:val="0"/>
+        </w:rPr>
+        <w:t xml:space="preserve">Issue with Cutoff configuration or tech issue</w:t>
+      </w:r>
+      <w:r>
+        <w:rPr>
+          <w:rtl w:val="0"/>
+        </w:rPr>
+      </w:r>
+    </w:p>
+    <w:p>
+      <w:pPr>
+        <w:numPr>
+          <w:ilvl w:val="0"/>
+          <w:numId w:val="28"/>
+        </w:numPr>
+        <w:spacing w:after="240" w:before="0" w:lineRule="auto"/>
+        <w:ind w:left="720" w:hanging="360"/>
+        <w:rPr>
+          <w:b w:val="1"/>
+          <w:bCs w:val="1"/>
+        </w:rPr>
+      </w:pPr>
+      <w:r>
+        <w:rPr>
+          <w:b w:val="1"/>
+          <w:bCs w:val="1"/>
+          <w:rtl w:val="0"/>
+        </w:rPr>
+        <w:t xml:space="preserve">Action: </w:t>
+      </w:r>
+      <w:r>
+        <w:rPr>
+          <w:rtl w:val="0"/>
+        </w:rPr>
+        <w:t xml:space="preserve">Ensure the desk booking workflow is correctly configured. Consult the Tech Team to troubleshoot and resolve any workflow issues in the system.</w:t>
+      </w:r>
+      <w:r>
+        <w:rPr>
+          <w:rtl w:val="0"/>
+        </w:rPr>
+      </w:r>
+    </w:p>
+    <w:p>
+      <w:pPr>
+        <w:spacing w:after="240" w:before="240" w:lineRule="auto"/>
+        <w:rPr>
+          <w:b w:val="1"/>
+          <w:bCs w:val="1"/>
+        </w:rPr>
+      </w:pPr>
+      <w:r>
+        <w:rPr>
+          <w:b w:val="1"/>
+          <w:bCs w:val="1"/>
+          <w:rtl w:val="0"/>
+        </w:rPr>
+        <w:t xml:space="preserve">4.20 Transport Booking Cut-Off Time is Incorrect</w:t>
+      </w:r>
+    </w:p>
+    <w:p>
+      <w:pPr>
+        <w:numPr>
+          <w:ilvl w:val="0"/>
+          <w:numId w:val="13"/>
+        </w:numPr>
+        <w:spacing w:after="0" w:before="240" w:lineRule="auto"/>
+        <w:ind w:left="720" w:hanging="360"/>
+        <w:rPr>
+          <w:b w:val="1"/>
+          <w:bCs w:val="1"/>
+        </w:rPr>
+      </w:pPr>
+      <w:r>
+        <w:rPr>
+          <w:b w:val="1"/>
+          <w:bCs w:val="1"/>
+          <w:rtl w:val="0"/>
+        </w:rPr>
+        <w:t xml:space="preserve">Issue: </w:t>
+      </w:r>
+      <w:r>
+        <w:rPr>
+          <w:rtl w:val="0"/>
+        </w:rPr>
+        <w:t xml:space="preserve">Transport booking cut-off time conflicts with WIS booking. </w:t>
+      </w:r>
+      <w:r>
+        <w:rPr>
+          <w:rtl w:val="0"/>
+        </w:rPr>
+      </w:r>
+    </w:p>
+    <w:p>
+      <w:pPr>
+        <w:numPr>
+          <w:ilvl w:val="0"/>
+          <w:numId w:val="13"/>
+        </w:numPr>
+        <w:spacing w:after="240" w:before="0" w:lineRule="auto"/>
+        <w:ind w:left="720" w:hanging="360"/>
+        <w:rPr>
+          <w:b w:val="1"/>
+          <w:bCs w:val="1"/>
+        </w:rPr>
+      </w:pPr>
+      <w:r>
+        <w:rPr>
+          <w:b w:val="1"/>
+          <w:bCs w:val="1"/>
+          <w:rtl w:val="0"/>
+        </w:rPr>
+        <w:t xml:space="preserve">Action:</w:t>
+      </w:r>
+      <w:r>
+        <w:rPr>
+          <w:rtl w:val="0"/>
+        </w:rPr>
+        <w:t xml:space="preserve"> Confirm that the transport booking cut-off times are in sync with the agreed WIS cutoff. Raise an SE ticket if there are discrepancies.</w:t>
+      </w:r>
+      <w:r>
+        <w:rPr>
+          <w:rtl w:val="0"/>
+        </w:rPr>
+      </w:r>
+    </w:p>
+    <w:p>
+      <w:pPr>
+        <w:spacing w:after="240" w:before="240" w:lineRule="auto"/>
+        <w:rPr>
+          <w:b w:val="1"/>
+          <w:bCs w:val="1"/>
+        </w:rPr>
+      </w:pPr>
+      <w:r>
+        <w:rPr>
+          <w:b w:val="1"/>
+          <w:bCs w:val="1"/>
+          <w:rtl w:val="0"/>
+        </w:rPr>
+        <w:t xml:space="preserve">4.21 User Profile Data Incomplete After Migration</w:t>
+      </w:r>
+    </w:p>
+    <w:p>
+      <w:pPr>
+        <w:numPr>
+          <w:ilvl w:val="0"/>
+          <w:numId w:val="30"/>
+        </w:numPr>
+        <w:spacing w:after="0" w:before="240" w:lineRule="auto"/>
+        <w:ind w:left="720" w:hanging="360"/>
+        <w:rPr>
+          <w:b w:val="1"/>
+          <w:bCs w:val="1"/>
+        </w:rPr>
+      </w:pPr>
+      <w:r>
+        <w:rPr>
+          <w:b w:val="1"/>
+          <w:bCs w:val="1"/>
+          <w:rtl w:val="0"/>
+        </w:rPr>
+        <w:t xml:space="preserve">Issue: </w:t>
+      </w:r>
+      <w:r>
+        <w:rPr>
+          <w:rtl w:val="0"/>
+        </w:rPr>
+        <w:t xml:space="preserve">Missing fields in user profiles post-migration.</w:t>
+      </w:r>
+      <w:r>
+        <w:rPr>
+          <w:rtl w:val="0"/>
+        </w:rPr>
+      </w:r>
+    </w:p>
+    <w:p>
+      <w:pPr>
+        <w:numPr>
+          <w:ilvl w:val="0"/>
+          <w:numId w:val="30"/>
+        </w:numPr>
+        <w:spacing w:after="240" w:before="0" w:lineRule="auto"/>
+        <w:ind w:left="720" w:hanging="360"/>
+        <w:rPr>
+          <w:b w:val="1"/>
+          <w:bCs w:val="1"/>
+        </w:rPr>
+      </w:pPr>
+      <w:r>
+        <w:rPr>
+          <w:b w:val="1"/>
+          <w:bCs w:val="1"/>
+          <w:rtl w:val="0"/>
+        </w:rPr>
+        <w:t xml:space="preserve">Action: </w:t>
+      </w:r>
+      <w:r>
+        <w:rPr>
+          <w:rtl w:val="0"/>
+        </w:rPr>
+        <w:t xml:space="preserve">Identify which fields are missing and ensure the employee data was backed up properly. Request the HR Team or Data Team to provide missing details, and update the profiles in the system. In case of HRMS integration in place</w:t>
+      </w:r>
+      <w:r>
+        <w:rPr>
+          <w:rtl w:val="0"/>
+        </w:rPr>
+      </w:r>
+    </w:p>
+    <w:p>
+      <w:pPr>
+        <w:spacing w:after="240" w:before="240" w:lineRule="auto"/>
+        <w:rPr>
+          <w:b w:val="1"/>
+          <w:bCs w:val="1"/>
+        </w:rPr>
+      </w:pPr>
+      <w:r>
+        <w:rPr>
+          <w:b w:val="1"/>
+          <w:bCs w:val="1"/>
+          <w:rtl w:val="0"/>
+        </w:rPr>
+        <w:t xml:space="preserve">4.22 Users Facing Delays in Vehicle number Confirmation</w:t>
       </w:r>
     </w:p>
     <w:p>
@@ -3053,309 +3609,40 @@
           <w:ilvl w:val="0"/>
           <w:numId w:val="35"/>
         </w:numPr>
-        <w:spacing w:after="240" w:before="0" w:beforeAutospacing="0" w:lineRule="auto"/>
-        <w:ind w:left="720" w:hanging="360"/>
-        <w:rPr>
-          <w:b w:val="1"/>
-          <w:bCs w:val="1"/>
-        </w:rPr>
-      </w:pPr>
-      <w:r>
-        <w:rPr>
-          <w:b w:val="1"/>
-          <w:bCs w:val="1"/>
-          <w:rtl w:val="0"/>
-        </w:rPr>
-        <w:t xml:space="preserve">Action: </w:t>
-      </w:r>
-      <w:r>
-        <w:rPr>
-          <w:rtl w:val="0"/>
-        </w:rPr>
-        <w:t xml:space="preserve">Raise an Blocker SE ticket to back up the system's current configuration and prevent any potential operational issue. Ensure future testing does not proceed without this configuration completed.</w:t>
-      </w:r>
-      <w:r>
-        <w:rPr>
-          <w:rtl w:val="0"/>
-        </w:rPr>
-      </w:r>
-    </w:p>
-    <w:p>
-      <w:pPr>
-        <w:spacing w:after="240" w:before="240" w:lineRule="auto"/>
-        <w:rPr>
-          <w:b w:val="1"/>
-          <w:bCs w:val="1"/>
-        </w:rPr>
-      </w:pPr>
-      <w:r>
-        <w:rPr>
-          <w:b w:val="1"/>
-          <w:bCs w:val="1"/>
-          <w:rtl w:val="0"/>
-        </w:rPr>
-        <w:t xml:space="preserve">4.19 Available Desk Booking Failing</w:t>
+        <w:spacing w:after="0" w:before="240" w:lineRule="auto"/>
+        <w:ind w:left="720" w:hanging="360"/>
+        <w:rPr>
+          <w:b w:val="1"/>
+          <w:bCs w:val="1"/>
+        </w:rPr>
+      </w:pPr>
+      <w:r>
+        <w:rPr>
+          <w:b w:val="1"/>
+          <w:bCs w:val="1"/>
+          <w:rtl w:val="0"/>
+        </w:rPr>
+        <w:t xml:space="preserve">Issue: </w:t>
+      </w:r>
+      <w:r>
+        <w:rPr>
+          <w:rtl w:val="0"/>
+        </w:rPr>
+        <w:t xml:space="preserve">Vehicle is not assigned to the route by Admin.</w:t>
+      </w:r>
+      <w:r>
+        <w:rPr>
+          <w:rtl w:val="0"/>
+        </w:rPr>
       </w:r>
     </w:p>
     <w:p>
       <w:pPr>
         <w:numPr>
           <w:ilvl w:val="0"/>
-          <w:numId w:val="34"/>
-        </w:numPr>
-        <w:spacing w:after="0" w:afterAutospacing="0" w:before="240" w:lineRule="auto"/>
-        <w:ind w:left="720" w:hanging="360"/>
-        <w:rPr>
-          <w:b w:val="1"/>
-          <w:bCs w:val="1"/>
-        </w:rPr>
-      </w:pPr>
-      <w:r>
-        <w:rPr>
-          <w:b w:val="1"/>
-          <w:bCs w:val="1"/>
-          <w:rtl w:val="0"/>
-        </w:rPr>
-        <w:t xml:space="preserve">Issue: </w:t>
-      </w:r>
-      <w:r>
-        <w:rPr>
-          <w:rtl w:val="0"/>
-        </w:rPr>
-        <w:t xml:space="preserve">Issue with Cutoff configuration or tech issue</w:t>
-      </w:r>
-      <w:r>
-        <w:rPr>
-          <w:rtl w:val="0"/>
-        </w:rPr>
-      </w:r>
-    </w:p>
-    <w:p>
-      <w:pPr>
-        <w:numPr>
-          <w:ilvl w:val="0"/>
-          <w:numId w:val="34"/>
-        </w:numPr>
-        <w:spacing w:after="240" w:before="0" w:beforeAutospacing="0" w:lineRule="auto"/>
-        <w:ind w:left="720" w:hanging="360"/>
-        <w:rPr>
-          <w:b w:val="1"/>
-          <w:bCs w:val="1"/>
-        </w:rPr>
-      </w:pPr>
-      <w:r>
-        <w:rPr>
-          <w:b w:val="1"/>
-          <w:bCs w:val="1"/>
-          <w:rtl w:val="0"/>
-        </w:rPr>
-        <w:t xml:space="preserve">Action: </w:t>
-      </w:r>
-      <w:r>
-        <w:rPr>
-          <w:rtl w:val="0"/>
-        </w:rPr>
-        <w:t xml:space="preserve">Ensure the desk booking workflow is correctly configured. Consult the Tech Team to troubleshoot and resolve any workflow issues in the system.</w:t>
-      </w:r>
-    </w:p>
-    <w:p>
-      <w:pPr>
-        <w:spacing w:after="240" w:before="240" w:lineRule="auto"/>
-        <w:rPr>
-          <w:b w:val="1"/>
-          <w:bCs w:val="1"/>
-        </w:rPr>
-      </w:pPr>
-      <w:r>
-        <w:rPr>
-          <w:b w:val="1"/>
-          <w:bCs w:val="1"/>
-          <w:rtl w:val="0"/>
-        </w:rPr>
-        <w:t xml:space="preserve">4.20 Transport Booking Cut-Off Time is Incorrect</w:t>
-      </w:r>
-    </w:p>
-    <w:p>
-      <w:pPr>
-        <w:numPr>
-          <w:ilvl w:val="0"/>
-          <w:numId w:val="20"/>
-        </w:numPr>
-        <w:spacing w:after="0" w:afterAutospacing="0" w:before="240" w:lineRule="auto"/>
-        <w:ind w:left="720" w:hanging="360"/>
-        <w:rPr>
-          <w:b w:val="1"/>
-          <w:bCs w:val="1"/>
-        </w:rPr>
-      </w:pPr>
-      <w:r>
-        <w:rPr>
-          <w:b w:val="1"/>
-          <w:bCs w:val="1"/>
-          <w:rtl w:val="0"/>
-        </w:rPr>
-        <w:t xml:space="preserve">Issue: </w:t>
-      </w:r>
-      <w:r>
-        <w:rPr>
-          <w:rtl w:val="0"/>
-        </w:rPr>
-        <w:t xml:space="preserve">Transport booking cut-off time conflicts with WIS booking. </w:t>
-      </w:r>
-    </w:p>
-    <w:p>
-      <w:pPr>
-        <w:numPr>
-          <w:ilvl w:val="0"/>
-          <w:numId w:val="20"/>
-        </w:numPr>
-        <w:spacing w:after="240" w:before="0" w:beforeAutospacing="0" w:lineRule="auto"/>
-        <w:ind w:left="720" w:hanging="360"/>
-        <w:rPr>
-          <w:b w:val="1"/>
-          <w:bCs w:val="1"/>
-        </w:rPr>
-      </w:pPr>
-      <w:r>
-        <w:rPr>
-          <w:b w:val="1"/>
-          <w:bCs w:val="1"/>
-          <w:rtl w:val="0"/>
-        </w:rPr>
-        <w:t xml:space="preserve">Action:</w:t>
-      </w:r>
-      <w:r>
-        <w:rPr>
-          <w:rtl w:val="0"/>
-        </w:rPr>
-        <w:t xml:space="preserve"> Confirm that the transport booking cut-off times are in sync with the agreed WIS cutoff. Raise an SE ticket if there are discrepancies.</w:t>
-      </w:r>
-    </w:p>
-    <w:p>
-      <w:pPr>
-        <w:spacing w:after="240" w:before="240" w:lineRule="auto"/>
-        <w:rPr>
-          <w:b w:val="1"/>
-          <w:bCs w:val="1"/>
-        </w:rPr>
-      </w:pPr>
-      <w:r>
-        <w:rPr>
-          <w:b w:val="1"/>
-          <w:bCs w:val="1"/>
-          <w:rtl w:val="0"/>
-        </w:rPr>
-        <w:t xml:space="preserve">4.21 User Profile Data Incomplete After Migration</w:t>
-      </w:r>
-    </w:p>
-    <w:p>
-      <w:pPr>
-        <w:numPr>
-          <w:ilvl w:val="0"/>
-          <w:numId w:val="36"/>
-        </w:numPr>
-        <w:spacing w:after="0" w:afterAutospacing="0" w:before="240" w:lineRule="auto"/>
-        <w:ind w:left="720" w:hanging="360"/>
-        <w:rPr>
-          <w:b w:val="1"/>
-          <w:bCs w:val="1"/>
-        </w:rPr>
-      </w:pPr>
-      <w:r>
-        <w:rPr>
-          <w:b w:val="1"/>
-          <w:bCs w:val="1"/>
-          <w:rtl w:val="0"/>
-        </w:rPr>
-        <w:t xml:space="preserve">Issue: </w:t>
-      </w:r>
-      <w:r>
-        <w:rPr>
-          <w:rtl w:val="0"/>
-        </w:rPr>
-        <w:t xml:space="preserve">Missing fields in user profiles post-migration.</w:t>
-      </w:r>
-    </w:p>
-    <w:p>
-      <w:pPr>
-        <w:numPr>
-          <w:ilvl w:val="0"/>
-          <w:numId w:val="36"/>
-        </w:numPr>
-        <w:spacing w:after="240" w:before="0" w:beforeAutospacing="0" w:lineRule="auto"/>
-        <w:ind w:left="720" w:hanging="360"/>
-        <w:rPr>
-          <w:b w:val="1"/>
-          <w:bCs w:val="1"/>
-        </w:rPr>
-      </w:pPr>
-      <w:r>
-        <w:rPr>
-          <w:b w:val="1"/>
-          <w:bCs w:val="1"/>
-          <w:rtl w:val="0"/>
-        </w:rPr>
-        <w:t xml:space="preserve">Action: </w:t>
-      </w:r>
-      <w:r>
-        <w:rPr>
-          <w:rtl w:val="0"/>
-        </w:rPr>
-        <w:t xml:space="preserve">Identify which fields are missing and ensure the employee data was backed up properly. Request the HR Team or Data Team to provide missing details, and update the profiles in the system. In case of HRMS integration in place</w:t>
-      </w:r>
-    </w:p>
-    <w:p>
-      <w:pPr>
-        <w:spacing w:after="240" w:before="240" w:lineRule="auto"/>
-        <w:rPr>
-          <w:b w:val="1"/>
-          <w:bCs w:val="1"/>
-        </w:rPr>
-      </w:pPr>
-      <w:r>
-        <w:rPr>
-          <w:b w:val="1"/>
-          <w:bCs w:val="1"/>
-          <w:rtl w:val="0"/>
-        </w:rPr>
-        <w:t xml:space="preserve">4.22 Users Facing Delays in Vehicle number Confirmation</w:t>
-      </w:r>
-    </w:p>
-    <w:p>
-      <w:pPr>
-        <w:numPr>
-          <w:ilvl w:val="0"/>
-          <w:numId w:val="40"/>
-        </w:numPr>
-        <w:spacing w:after="0" w:afterAutospacing="0" w:before="240" w:lineRule="auto"/>
-        <w:ind w:left="720" w:hanging="360"/>
-        <w:rPr>
-          <w:b w:val="1"/>
-          <w:bCs w:val="1"/>
-        </w:rPr>
-      </w:pPr>
-      <w:r>
-        <w:rPr>
-          <w:b w:val="1"/>
-          <w:bCs w:val="1"/>
-          <w:rtl w:val="0"/>
-        </w:rPr>
-        <w:t xml:space="preserve">Issue: </w:t>
-      </w:r>
-      <w:r>
-        <w:rPr>
-          <w:rtl w:val="0"/>
-        </w:rPr>
-        <w:t xml:space="preserve">Vehicle is not assigned to the route by Admin.</w:t>
-      </w:r>
-    </w:p>
-    <w:p>
-      <w:pPr>
-        <w:numPr>
-          <w:ilvl w:val="0"/>
-          <w:numId w:val="40"/>
-        </w:numPr>
-        <w:spacing w:after="240" w:before="0" w:beforeAutospacing="0" w:lineRule="auto"/>
+          <w:numId w:val="35"/>
+        </w:numPr>
+        <w:spacing w:after="240" w:before="0" w:lineRule="auto"/>
         <w:ind w:left="720" w:hanging="360"/>
         <w:rPr>
           <w:b w:val="1"/>
@@ -3378,6 +3665,11 @@
         <w:br w:type="textWrapping"/>
         <w:t xml:space="preserve">&gt;&gt; Connect with the Emp Exp team if the issue continues.</w:t>
       </w:r>
+      <w:r>
+        <w:rPr>
+          <w:rtl w:val="0"/>
+        </w:rPr>
+      </w:r>
     </w:p>
     <w:p>
       <w:pPr>
@@ -3428,9 +3720,9 @@
       <w:pPr>
         <w:numPr>
           <w:ilvl w:val="0"/>
-          <w:numId w:val="4"/>
-        </w:numPr>
-        <w:spacing w:after="0" w:afterAutospacing="0" w:before="240" w:lineRule="auto"/>
+          <w:numId w:val="34"/>
+        </w:numPr>
+        <w:spacing w:after="0" w:before="240" w:lineRule="auto"/>
         <w:ind w:left="720" w:hanging="360"/>
         <w:rPr>
           <w:b w:val="1"/>
@@ -3451,14 +3743,19 @@
         </w:rPr>
         <w:t xml:space="preserve">Cutoff is passed.</w:t>
       </w:r>
+      <w:r>
+        <w:rPr>
+          <w:rtl w:val="0"/>
+        </w:rPr>
+      </w:r>
     </w:p>
     <w:p>
       <w:pPr>
         <w:numPr>
           <w:ilvl w:val="0"/>
-          <w:numId w:val="4"/>
-        </w:numPr>
-        <w:spacing w:after="240" w:before="0" w:beforeAutospacing="0" w:lineRule="auto"/>
+          <w:numId w:val="34"/>
+        </w:numPr>
+        <w:spacing w:after="240" w:before="0" w:lineRule="auto"/>
         <w:ind w:left="720" w:hanging="360"/>
         <w:rPr>
           <w:b w:val="1"/>
@@ -3478,6 +3775,11 @@
           <w:rtl w:val="0"/>
         </w:rPr>
         <w:t xml:space="preserve">Check if the issue is legit and within cutoff. </w:t>
+      </w:r>
+      <w:r>
+        <w:rPr>
+          <w:rtl w:val="0"/>
+        </w:rPr>
       </w:r>
     </w:p>
     <w:p>
@@ -3503,7 +3805,7 @@
           <w:ilvl w:val="0"/>
           <w:numId w:val="1"/>
         </w:numPr>
-        <w:spacing w:after="0" w:afterAutospacing="0" w:before="240" w:lineRule="auto"/>
+        <w:spacing w:after="0" w:before="240" w:lineRule="auto"/>
         <w:ind w:left="720" w:hanging="360"/>
         <w:rPr>
           <w:b w:val="1"/>
@@ -3539,7 +3841,7 @@
           <w:ilvl w:val="0"/>
           <w:numId w:val="1"/>
         </w:numPr>
-        <w:spacing w:after="240" w:before="0" w:beforeAutospacing="0" w:lineRule="auto"/>
+        <w:spacing w:after="240" w:before="0" w:lineRule="auto"/>
         <w:ind w:left="720" w:hanging="360"/>
         <w:rPr>
           <w:b w:val="1"/>
@@ -3559,6 +3861,11 @@
           <w:rtl w:val="0"/>
         </w:rPr>
         <w:t xml:space="preserve">Review user role settings and ensure permissions are correctly assigned based on user profiles (Global admin/Front office/Employee/MSU/Team Manager etc). Involve the SE Team or PM to update user roles if needed.</w:t>
+      </w:r>
+      <w:r>
+        <w:rPr>
+          <w:rtl w:val="0"/>
+        </w:rPr>
       </w:r>
     </w:p>
     <w:p>
@@ -3590,7 +3897,7 @@
           <w:szCs w:val="26"/>
         </w:rPr>
       </w:pPr>
-      <w:bookmarkStart w:colFirst="0" w:colLast="0" w:name="_mrnth3s4yf4t" w:id="7"/>
+      <w:bookmarkStart w:colFirst="0" w:colLast="0" w:name="_heading=h.u80hfo4uk3wd" w:id="7"/>
       <w:bookmarkEnd w:id="7"/>
       <w:r>
         <w:rPr>
@@ -3660,7 +3967,7 @@
           <w:bCs w:val="1"/>
         </w:rPr>
       </w:pPr>
-      <w:bookmarkStart w:colFirst="0" w:colLast="0" w:name="_sl7175f8djxv" w:id="8"/>
+      <w:bookmarkStart w:colFirst="0" w:colLast="0" w:name="_heading=h.epxjnp80fpau" w:id="8"/>
       <w:bookmarkEnd w:id="8"/>
       <w:r>
         <w:rPr>
@@ -3675,15 +3982,15 @@
       <w:pPr>
         <w:numPr>
           <w:ilvl w:val="0"/>
-          <w:numId w:val="19"/>
-        </w:numPr>
-        <w:spacing w:after="0" w:afterAutospacing="0" w:before="240" w:lineRule="auto"/>
+          <w:numId w:val="11"/>
+        </w:numPr>
+        <w:spacing w:after="0" w:before="240" w:lineRule="auto"/>
         <w:ind w:left="720" w:hanging="360"/>
         <w:rPr>
           <w:u w:val="none"/>
         </w:rPr>
       </w:pPr>
-      <w:hyperlink r:id="rId6">
+      <w:hyperlink r:id="rId7">
         <w:r>
           <w:rPr>
             <w:color w:val="1155cc"/>
@@ -3703,15 +4010,15 @@
       <w:pPr>
         <w:numPr>
           <w:ilvl w:val="0"/>
-          <w:numId w:val="19"/>
-        </w:numPr>
-        <w:spacing w:after="0" w:afterAutospacing="0" w:before="0" w:beforeAutospacing="0" w:lineRule="auto"/>
+          <w:numId w:val="11"/>
+        </w:numPr>
+        <w:spacing w:after="0" w:before="0" w:lineRule="auto"/>
         <w:ind w:left="720" w:hanging="360"/>
         <w:rPr>
           <w:u w:val="none"/>
         </w:rPr>
       </w:pPr>
-      <w:hyperlink r:id="rId7">
+      <w:hyperlink r:id="rId8">
         <w:r>
           <w:rPr>
             <w:color w:val="1155cc"/>
@@ -3731,15 +4038,15 @@
       <w:pPr>
         <w:numPr>
           <w:ilvl w:val="0"/>
-          <w:numId w:val="19"/>
-        </w:numPr>
-        <w:spacing w:after="0" w:afterAutospacing="0" w:before="0" w:beforeAutospacing="0" w:lineRule="auto"/>
+          <w:numId w:val="11"/>
+        </w:numPr>
+        <w:spacing w:after="0" w:before="0" w:lineRule="auto"/>
         <w:ind w:left="720" w:hanging="360"/>
         <w:rPr>
           <w:u w:val="none"/>
         </w:rPr>
       </w:pPr>
-      <w:hyperlink r:id="rId8">
+      <w:hyperlink r:id="rId9">
         <w:r>
           <w:rPr>
             <w:color w:val="1155cc"/>
@@ -3759,15 +4066,15 @@
       <w:pPr>
         <w:numPr>
           <w:ilvl w:val="0"/>
-          <w:numId w:val="19"/>
-        </w:numPr>
-        <w:spacing w:after="0" w:afterAutospacing="0" w:before="0" w:beforeAutospacing="0" w:lineRule="auto"/>
+          <w:numId w:val="11"/>
+        </w:numPr>
+        <w:spacing w:after="0" w:before="0" w:lineRule="auto"/>
         <w:ind w:left="720" w:hanging="360"/>
         <w:rPr>
           <w:u w:val="none"/>
         </w:rPr>
       </w:pPr>
-      <w:hyperlink r:id="rId9">
+      <w:hyperlink r:id="rId10">
         <w:r>
           <w:rPr>
             <w:color w:val="1155cc"/>
@@ -3787,15 +4094,15 @@
       <w:pPr>
         <w:numPr>
           <w:ilvl w:val="0"/>
-          <w:numId w:val="19"/>
-        </w:numPr>
-        <w:spacing w:after="0" w:afterAutospacing="0" w:before="0" w:beforeAutospacing="0" w:lineRule="auto"/>
+          <w:numId w:val="11"/>
+        </w:numPr>
+        <w:spacing w:after="0" w:before="0" w:lineRule="auto"/>
         <w:ind w:left="720" w:hanging="360"/>
         <w:rPr>
           <w:u w:val="none"/>
         </w:rPr>
       </w:pPr>
-      <w:hyperlink r:id="rId10">
+      <w:hyperlink r:id="rId11">
         <w:r>
           <w:rPr>
             <w:color w:val="1155cc"/>
@@ -3815,12 +4122,13 @@
       <w:pPr>
         <w:numPr>
           <w:ilvl w:val="0"/>
-          <w:numId w:val="19"/>
-        </w:numPr>
-        <w:spacing w:after="0" w:afterAutospacing="0" w:before="0" w:beforeAutospacing="0" w:lineRule="auto"/>
-        <w:ind w:left="720" w:hanging="360"/>
-      </w:pPr>
-      <w:hyperlink r:id="rId11">
+          <w:numId w:val="11"/>
+        </w:numPr>
+        <w:spacing w:after="0" w:before="0" w:lineRule="auto"/>
+        <w:ind w:left="720" w:hanging="360"/>
+        <w:rPr/>
+      </w:pPr>
+      <w:hyperlink r:id="rId12">
         <w:r>
           <w:rPr>
             <w:color w:val="1155cc"/>
@@ -3840,12 +4148,13 @@
       <w:pPr>
         <w:numPr>
           <w:ilvl w:val="0"/>
-          <w:numId w:val="19"/>
-        </w:numPr>
-        <w:spacing w:after="240" w:before="0" w:beforeAutospacing="0" w:lineRule="auto"/>
-        <w:ind w:left="720" w:hanging="360"/>
-      </w:pPr>
-      <w:hyperlink r:id="rId12">
+          <w:numId w:val="11"/>
+        </w:numPr>
+        <w:spacing w:after="240" w:before="0" w:lineRule="auto"/>
+        <w:ind w:left="720" w:hanging="360"/>
+        <w:rPr/>
+      </w:pPr>
+      <w:hyperlink r:id="rId13">
         <w:r>
           <w:rPr>
             <w:color w:val="1155cc"/>
@@ -3887,6 +4196,11 @@
         </w:rPr>
         <w:t xml:space="preserve"> </w:t>
       </w:r>
+      <w:r>
+        <w:rPr>
+          <w:rtl w:val="0"/>
+        </w:rPr>
+      </w:r>
     </w:p>
     <w:p>
       <w:pPr>
@@ -3895,7 +4209,7 @@
         <w:ind w:left="0" w:firstLine="0"/>
         <w:rPr/>
       </w:pPr>
-      <w:bookmarkStart w:colFirst="0" w:colLast="0" w:name="_7gf1bbwzdr40" w:id="9"/>
+      <w:bookmarkStart w:colFirst="0" w:colLast="0" w:name="_heading=h.yoetwgtx2qea" w:id="9"/>
       <w:bookmarkEnd w:id="9"/>
       <w:r>
         <w:rPr>
@@ -6789,8 +7103,8 @@
     </w:lvl>
     <w:lvl w:ilvl="1">
       <w:start w:val="1"/>
-      <w:numFmt w:val="bullet"/>
-      <w:lvlText w:val="○"/>
+      <w:numFmt w:val="decimal"/>
+      <w:lvlText w:val="%2."/>
       <w:lvlJc w:val="left"/>
       <w:pPr>
         <w:ind w:left="1440" w:hanging="360"/>
@@ -7449,8 +7763,8 @@
     </w:lvl>
     <w:lvl w:ilvl="1">
       <w:start w:val="1"/>
-      <w:numFmt w:val="decimal"/>
-      <w:lvlText w:val="%2."/>
+      <w:numFmt w:val="bullet"/>
+      <w:lvlText w:val="○"/>
       <w:lvlJc w:val="left"/>
       <w:pPr>
         <w:ind w:left="1440" w:hanging="360"/>
@@ -8923,4 +9237,19 @@
   </a:objectDefaults>
   <a:extraClrSchemeLst/>
 </a:theme>
+</file>
+
+<file path=customXML/item1.xml><?xml version="1.0" encoding="utf-8"?>
+<go:gDocsCustomXmlDataStorage xmlns:go="http://customooxmlschemas.google.com/" xmlns:r="http://schemas.openxmlformats.org/officeDocument/2006/relationships" uri="GoogleDocsCustomDataVersion2">
+  <go:docsCustomData xmlns:go="http://customooxmlschemas.google.com/" roundtripDataSignature="AMtx7mhf80jQWswBQyPoVykXTSsvtUCzCg==">CgMxLjAyDmguOWNtOW12dnRoajJtMg5oLm8xOWpjbnQ3aHdycjINaC5oZnN6bzg1d21zcjIOaC5uMnpzN2d5cjljNXUyDmguNDNnNW95ZjF5ZjRrMg5oLjZ0d2YyYTdkY3QxaDIOaC56MG5mdmlrYzVlZnkyDmgudTgwaGZvNHVrM3dkMg5oLmVweGpucDgwZnBhdTIOaC55b2V0d2d0eDJxZWE4AHIhMXpQTVlnZE9OZjVRNUxCOXg5Y2o2S1VfVUNyTklQNjZE</go:docsCustomData>
+</go:gDocsCustomXmlDataStorage>
+</file>
+
+<file path=customXML/itemProps1.xml><?xml version="1.0" encoding="utf-8"?>
+<ds:datastoreItem xmlns:ds="http://schemas.openxmlformats.org/officeDocument/2006/customXml" ds:itemID="{11111111-1234-1234-1234-123412341234}">
+  <ds:schemaRefs>
+    <ds:schemaRef ds:uri="http://schemas.openxmlformats.org/officeDocument/2006/relationships"/>
+    <ds:schemaRef ds:uri="http://customooxmlschemas.google.com/"/>
+  </ds:schemaRefs>
+</ds:datastoreItem>
 </file>
</xml_diff>